<commit_message>
feat: add training regulation PDF and update FAQ document
- Add 790-QD-DHCNTT training regulation PDF to raw data
- Update FAQ docx with latest content
</commit_message>
<xml_diff>
--- a/data/raw/Các câu hỏi thường gặp.docx
+++ b/data/raw/Các câu hỏi thường gặp.docx
@@ -809,33 +809,17 @@
         </w:rPr>
         <w:t xml:space="preserve">Link tham khảo ngày hội việc làm: </w:t>
       </w:r>
-      <w:r>
-        <w:fldChar w:fldCharType="begin"/>
-      </w:r>
-      <w:r>
-        <w:instrText>HYPERLINK "https://www.facebook.com/CITD.UIT/posts/pfbid0B71kzyhfTPdEDdFRb4M7fMe897XJS4q5DmiBpJ7TfuwFoUWSJKHrx9gC9hwwaWijl" \h</w:instrText>
-      </w:r>
-      <w:r>
-        <w:fldChar w:fldCharType="separate"/>
-      </w:r>
-      <w:r>
-        <w:rPr>
-          <w:rFonts w:ascii="Verdana" w:eastAsia="Verdana" w:hAnsi="Verdana" w:cs="Verdana"/>
-          <w:color w:val="4DB2EC"/>
-          <w:sz w:val="23"/>
-          <w:szCs w:val="23"/>
-        </w:rPr>
-        <w:t>Ngày hội việc làm – CITD | Facebook</w:t>
-      </w:r>
-      <w:r>
-        <w:rPr>
-          <w:rFonts w:ascii="Verdana" w:eastAsia="Verdana" w:hAnsi="Verdana" w:cs="Verdana"/>
-          <w:color w:val="4DB2EC"/>
-          <w:sz w:val="23"/>
-          <w:szCs w:val="23"/>
-        </w:rPr>
-        <w:fldChar w:fldCharType="end"/>
-      </w:r>
+      <w:hyperlink r:id="rId8">
+        <w:r>
+          <w:rPr>
+            <w:rFonts w:ascii="Verdana" w:eastAsia="Verdana" w:hAnsi="Verdana" w:cs="Verdana"/>
+            <w:color w:val="4DB2EC"/>
+            <w:sz w:val="23"/>
+            <w:szCs w:val="23"/>
+          </w:rPr>
+          <w:t>Ngày hội việc làm – CITD | Facebook</w:t>
+        </w:r>
+      </w:hyperlink>
       <w:r>
         <w:rPr>
           <w:rFonts w:ascii="Verdana" w:eastAsia="Verdana" w:hAnsi="Verdana" w:cs="Verdana"/>
@@ -845,7 +829,7 @@
         </w:rPr>
         <w:t xml:space="preserve"> và </w:t>
       </w:r>
-      <w:hyperlink r:id="rId8">
+      <w:hyperlink r:id="rId9">
         <w:r>
           <w:rPr>
             <w:rFonts w:ascii="Verdana" w:eastAsia="Verdana" w:hAnsi="Verdana" w:cs="Verdana"/>
@@ -874,34 +858,18 @@
         </w:rPr>
         <w:t xml:space="preserve">Link hướng dẫn tạo CV </w:t>
       </w:r>
-      <w:r>
-        <w:fldChar w:fldCharType="begin"/>
-      </w:r>
-      <w:r>
-        <w:instrText>HYPERLINK "https://www.facebook.com/photo/?fbid=899319661997759&amp;set=pb.100057591995145.-2207520000" \h</w:instrText>
-      </w:r>
-      <w:r>
-        <w:fldChar w:fldCharType="separate"/>
-      </w:r>
-      <w:r>
-        <w:rPr>
-          <w:rFonts w:ascii="Verdana" w:eastAsia="Verdana" w:hAnsi="Verdana" w:cs="Verdana"/>
-          <w:color w:val="4DB2EC"/>
-          <w:sz w:val="23"/>
-          <w:szCs w:val="23"/>
-        </w:rPr>
-        <w:t xml:space="preserve">– Mẹo thiết kế CV Phù hợp </w:t>
-      </w:r>
-      <w:r>
-        <w:rPr>
-          <w:rFonts w:ascii="Verdana" w:eastAsia="Verdana" w:hAnsi="Verdana" w:cs="Verdana"/>
-          <w:color w:val="4DB2EC"/>
-          <w:sz w:val="23"/>
-          <w:szCs w:val="23"/>
-        </w:rPr>
-        <w:fldChar w:fldCharType="end"/>
-      </w:r>
-      <w:hyperlink r:id="rId9">
+      <w:hyperlink r:id="rId10">
+        <w:r>
+          <w:rPr>
+            <w:rFonts w:ascii="Verdana" w:eastAsia="Verdana" w:hAnsi="Verdana" w:cs="Verdana"/>
+            <w:color w:val="4DB2EC"/>
+            <w:sz w:val="23"/>
+            <w:szCs w:val="23"/>
+          </w:rPr>
+          <w:t xml:space="preserve">– Mẹo thiết kế CV Phù hợp </w:t>
+        </w:r>
+      </w:hyperlink>
+      <w:hyperlink r:id="rId11">
         <w:r>
           <w:rPr>
             <w:rFonts w:ascii="Verdana" w:eastAsia="Verdana" w:hAnsi="Verdana" w:cs="Verdana"/>
@@ -912,7 +880,7 @@
           <w:t xml:space="preserve">– CITD | </w:t>
         </w:r>
       </w:hyperlink>
-      <w:hyperlink r:id="rId10">
+      <w:hyperlink r:id="rId12">
         <w:r>
           <w:rPr>
             <w:rFonts w:ascii="Verdana" w:eastAsia="Verdana" w:hAnsi="Verdana" w:cs="Verdana"/>
@@ -1011,7 +979,7 @@
         <w:spacing w:before="220"/>
         <w:ind w:left="1040"/>
       </w:pPr>
-      <w:hyperlink r:id="rId11">
+      <w:hyperlink r:id="rId13">
         <w:r>
           <w:rPr>
             <w:rFonts w:ascii="Verdana" w:eastAsia="Verdana" w:hAnsi="Verdana" w:cs="Verdana"/>
@@ -1041,7 +1009,7 @@
         <w:shd w:val="clear" w:color="auto" w:fill="FFFFFF"/>
         <w:ind w:left="1040"/>
       </w:pPr>
-      <w:hyperlink r:id="rId12">
+      <w:hyperlink r:id="rId14">
         <w:r>
           <w:rPr>
             <w:rFonts w:ascii="Verdana" w:eastAsia="Verdana" w:hAnsi="Verdana" w:cs="Verdana"/>
@@ -1072,7 +1040,7 @@
         <w:spacing w:after="400"/>
         <w:ind w:left="1040"/>
       </w:pPr>
-      <w:hyperlink r:id="rId13">
+      <w:hyperlink r:id="rId15">
         <w:r>
           <w:rPr>
             <w:rFonts w:ascii="Verdana" w:eastAsia="Verdana" w:hAnsi="Verdana" w:cs="Verdana"/>
@@ -1092,33 +1060,17 @@
         </w:rPr>
         <w:t xml:space="preserve">: Dành cho các bạn đã tốt nghiệp cao đẳng các ngành thuộc lĩnh vực công nghệ thông tin. Xét tuyển căn cứ trên bằng tốt nghiệp cao đẳng và điểm tích luỹ tại hệ Cao đẳng. (Các bạn có thể xem các ngành được liên thông </w:t>
       </w:r>
-      <w:r>
-        <w:fldChar w:fldCharType="begin"/>
-      </w:r>
-      <w:r>
-        <w:instrText>HYPERLINK "https://www.citd.vn/doi-tuong-lien-thong-dai-hoc-nganh-cong-nghe-thong-tin-tai-uit-he-dao-tao-tu-xa/" \h</w:instrText>
-      </w:r>
-      <w:r>
-        <w:fldChar w:fldCharType="separate"/>
-      </w:r>
-      <w:r>
-        <w:rPr>
-          <w:rFonts w:ascii="Verdana" w:eastAsia="Verdana" w:hAnsi="Verdana" w:cs="Verdana"/>
-          <w:color w:val="4DB2EC"/>
-          <w:sz w:val="23"/>
-          <w:szCs w:val="23"/>
-        </w:rPr>
-        <w:t>tại đây</w:t>
-      </w:r>
-      <w:r>
-        <w:rPr>
-          <w:rFonts w:ascii="Verdana" w:eastAsia="Verdana" w:hAnsi="Verdana" w:cs="Verdana"/>
-          <w:color w:val="4DB2EC"/>
-          <w:sz w:val="23"/>
-          <w:szCs w:val="23"/>
-        </w:rPr>
-        <w:fldChar w:fldCharType="end"/>
-      </w:r>
+      <w:hyperlink r:id="rId16">
+        <w:r>
+          <w:rPr>
+            <w:rFonts w:ascii="Verdana" w:eastAsia="Verdana" w:hAnsi="Verdana" w:cs="Verdana"/>
+            <w:color w:val="4DB2EC"/>
+            <w:sz w:val="23"/>
+            <w:szCs w:val="23"/>
+          </w:rPr>
+          <w:t>tại đây</w:t>
+        </w:r>
+      </w:hyperlink>
       <w:r>
         <w:rPr>
           <w:rFonts w:ascii="Verdana" w:eastAsia="Verdana" w:hAnsi="Verdana" w:cs="Verdana"/>
@@ -1185,7 +1137,7 @@
         <w:spacing w:before="220"/>
         <w:ind w:left="1040"/>
       </w:pPr>
-      <w:hyperlink r:id="rId14">
+      <w:hyperlink r:id="rId17">
         <w:r>
           <w:rPr>
             <w:rFonts w:ascii="Verdana" w:eastAsia="Verdana" w:hAnsi="Verdana" w:cs="Verdana"/>
@@ -1226,7 +1178,7 @@
         <w:shd w:val="clear" w:color="auto" w:fill="FFFFFF"/>
         <w:ind w:left="1040"/>
       </w:pPr>
-      <w:hyperlink r:id="rId15">
+      <w:hyperlink r:id="rId18">
         <w:r>
           <w:rPr>
             <w:rFonts w:ascii="Verdana" w:eastAsia="Verdana" w:hAnsi="Verdana" w:cs="Verdana"/>
@@ -1257,7 +1209,7 @@
         <w:spacing w:after="400"/>
         <w:ind w:left="1040"/>
       </w:pPr>
-      <w:hyperlink r:id="rId16">
+      <w:hyperlink r:id="rId19">
         <w:r>
           <w:rPr>
             <w:rFonts w:ascii="Verdana" w:eastAsia="Verdana" w:hAnsi="Verdana" w:cs="Verdana"/>
@@ -1277,33 +1229,17 @@
         </w:rPr>
         <w:t xml:space="preserve">: Dành cho các bạn đã tốt nghiệp cao đẳng các ngành thuộc lĩnh vực công nghệ thông tin. Xét tuyển căn cứ trên bằng tốt nghiệp cao đẳng và điểm tích luỹ tại hệ Cao đẳng.(Các bạn có thể xem các ngành được liên thông </w:t>
       </w:r>
-      <w:r>
-        <w:fldChar w:fldCharType="begin"/>
-      </w:r>
-      <w:r>
-        <w:instrText>HYPERLINK "https://www.citd.vn/doi-tuong-lien-thong-dai-hoc-nganh-tri-tue-nhan-tao-tai-uit-he-dao-tao-tu-xa/" \h</w:instrText>
-      </w:r>
-      <w:r>
-        <w:fldChar w:fldCharType="separate"/>
-      </w:r>
-      <w:r>
-        <w:rPr>
-          <w:rFonts w:ascii="Verdana" w:eastAsia="Verdana" w:hAnsi="Verdana" w:cs="Verdana"/>
-          <w:color w:val="4DB2EC"/>
-          <w:sz w:val="23"/>
-          <w:szCs w:val="23"/>
-        </w:rPr>
-        <w:t>tại đây</w:t>
-      </w:r>
-      <w:r>
-        <w:rPr>
-          <w:rFonts w:ascii="Verdana" w:eastAsia="Verdana" w:hAnsi="Verdana" w:cs="Verdana"/>
-          <w:color w:val="4DB2EC"/>
-          <w:sz w:val="23"/>
-          <w:szCs w:val="23"/>
-        </w:rPr>
-        <w:fldChar w:fldCharType="end"/>
-      </w:r>
+      <w:hyperlink r:id="rId20">
+        <w:r>
+          <w:rPr>
+            <w:rFonts w:ascii="Verdana" w:eastAsia="Verdana" w:hAnsi="Verdana" w:cs="Verdana"/>
+            <w:color w:val="4DB2EC"/>
+            <w:sz w:val="23"/>
+            <w:szCs w:val="23"/>
+          </w:rPr>
+          <w:t>tại đây</w:t>
+        </w:r>
+      </w:hyperlink>
       <w:r>
         <w:rPr>
           <w:rFonts w:ascii="Verdana" w:eastAsia="Verdana" w:hAnsi="Verdana" w:cs="Verdana"/>
@@ -1414,33 +1350,17 @@
         </w:rPr>
         <w:t xml:space="preserve">Sinh viên và phụ huynh có thể like và follow Fanpage: </w:t>
       </w:r>
-      <w:r>
-        <w:fldChar w:fldCharType="begin"/>
-      </w:r>
-      <w:r>
-        <w:instrText>HYPERLINK "https://www.facebook.com/CITD.UIT" \h</w:instrText>
-      </w:r>
-      <w:r>
-        <w:fldChar w:fldCharType="separate"/>
-      </w:r>
-      <w:r>
-        <w:rPr>
-          <w:rFonts w:ascii="Verdana" w:eastAsia="Verdana" w:hAnsi="Verdana" w:cs="Verdana"/>
-          <w:color w:val="4DB2EC"/>
-          <w:sz w:val="23"/>
-          <w:szCs w:val="23"/>
-        </w:rPr>
-        <w:t>https://www.facebook.com/CITD.UIT</w:t>
-      </w:r>
-      <w:r>
-        <w:rPr>
-          <w:rFonts w:ascii="Verdana" w:eastAsia="Verdana" w:hAnsi="Verdana" w:cs="Verdana"/>
-          <w:color w:val="4DB2EC"/>
-          <w:sz w:val="23"/>
-          <w:szCs w:val="23"/>
-        </w:rPr>
-        <w:fldChar w:fldCharType="end"/>
-      </w:r>
+      <w:hyperlink r:id="rId21">
+        <w:r>
+          <w:rPr>
+            <w:rFonts w:ascii="Verdana" w:eastAsia="Verdana" w:hAnsi="Verdana" w:cs="Verdana"/>
+            <w:color w:val="4DB2EC"/>
+            <w:sz w:val="23"/>
+            <w:szCs w:val="23"/>
+          </w:rPr>
+          <w:t>https://www.facebook.com/CITD.UIT</w:t>
+        </w:r>
+      </w:hyperlink>
       <w:r>
         <w:rPr>
           <w:rFonts w:ascii="Verdana" w:eastAsia="Verdana" w:hAnsi="Verdana" w:cs="Verdana"/>
@@ -1610,7 +1530,7 @@
                     <pic:cNvPicPr preferRelativeResize="0"/>
                   </pic:nvPicPr>
                   <pic:blipFill>
-                    <a:blip r:embed="rId17"/>
+                    <a:blip r:embed="rId22"/>
                     <a:srcRect/>
                     <a:stretch>
                       <a:fillRect/>
@@ -1696,7 +1616,7 @@
         </w:numPr>
         <w:ind w:left="2080"/>
       </w:pPr>
-      <w:hyperlink r:id="rId18">
+      <w:hyperlink r:id="rId23">
         <w:r>
           <w:rPr>
             <w:rFonts w:ascii="Verdana" w:eastAsia="Verdana" w:hAnsi="Verdana" w:cs="Verdana"/>
@@ -1716,7 +1636,7 @@
         </w:numPr>
         <w:ind w:left="2080"/>
       </w:pPr>
-      <w:hyperlink r:id="rId19">
+      <w:hyperlink r:id="rId24">
         <w:r>
           <w:rPr>
             <w:rFonts w:ascii="Verdana" w:eastAsia="Verdana" w:hAnsi="Verdana" w:cs="Verdana"/>
@@ -1737,7 +1657,7 @@
         <w:spacing w:after="400"/>
         <w:ind w:left="2080"/>
       </w:pPr>
-      <w:hyperlink r:id="rId20">
+      <w:hyperlink r:id="rId25">
         <w:r>
           <w:rPr>
             <w:rFonts w:ascii="Verdana" w:eastAsia="Verdana" w:hAnsi="Verdana" w:cs="Verdana"/>
@@ -2326,33 +2246,17 @@
         </w:rPr>
         <w:t xml:space="preserve">Mẫu bằng có thể xem tại đây: </w:t>
       </w:r>
-      <w:r>
-        <w:fldChar w:fldCharType="begin"/>
-      </w:r>
-      <w:r>
-        <w:instrText>HYPERLINK "https://daa.uit.edu.vn/sites/daa/files/202303/172_-quy_che_van_bang_chung_chi_15-3-2023_0.pdf" \h</w:instrText>
-      </w:r>
-      <w:r>
-        <w:fldChar w:fldCharType="separate"/>
-      </w:r>
-      <w:r>
-        <w:rPr>
-          <w:rFonts w:ascii="Verdana" w:eastAsia="Verdana" w:hAnsi="Verdana" w:cs="Verdana"/>
-          <w:color w:val="4DB2EC"/>
-          <w:sz w:val="23"/>
-          <w:szCs w:val="23"/>
-        </w:rPr>
-        <w:t>https://daa.uit.edu.vn/sites/daa/files/202303/172_-quy_che_van_bang_chung_chi_15-3-2023_0.pdf</w:t>
-      </w:r>
-      <w:r>
-        <w:rPr>
-          <w:rFonts w:ascii="Verdana" w:eastAsia="Verdana" w:hAnsi="Verdana" w:cs="Verdana"/>
-          <w:color w:val="4DB2EC"/>
-          <w:sz w:val="23"/>
-          <w:szCs w:val="23"/>
-        </w:rPr>
-        <w:fldChar w:fldCharType="end"/>
-      </w:r>
+      <w:hyperlink r:id="rId26">
+        <w:r>
+          <w:rPr>
+            <w:rFonts w:ascii="Verdana" w:eastAsia="Verdana" w:hAnsi="Verdana" w:cs="Verdana"/>
+            <w:color w:val="4DB2EC"/>
+            <w:sz w:val="23"/>
+            <w:szCs w:val="23"/>
+          </w:rPr>
+          <w:t>https://daa.uit.edu.vn/sites/daa/files/202303/172_-quy_che_van_bang_chung_chi_15-3-2023_0.pdf</w:t>
+        </w:r>
+      </w:hyperlink>
       <w:r>
         <w:rPr>
           <w:rFonts w:ascii="Verdana" w:eastAsia="Verdana" w:hAnsi="Verdana" w:cs="Verdana"/>
@@ -2396,7 +2300,7 @@
                     <pic:cNvPicPr preferRelativeResize="0"/>
                   </pic:nvPicPr>
                   <pic:blipFill>
-                    <a:blip r:embed="rId17"/>
+                    <a:blip r:embed="rId22"/>
                     <a:srcRect/>
                     <a:stretch>
                       <a:fillRect/>
@@ -2582,33 +2486,17 @@
         </w:rPr>
         <w:t xml:space="preserve">Chương trình đào tạo từ xa ngành Công nghệ Thông tin được thực hiện qua </w:t>
       </w:r>
-      <w:r>
-        <w:fldChar w:fldCharType="begin"/>
-      </w:r>
-      <w:r>
-        <w:instrText>HYPERLINK "https://www.citd.vn/huong-dan-su-dung-day-va-hoc-truc-tuyen-su-dung-phan-mem-microsoft-teams/" \h</w:instrText>
-      </w:r>
-      <w:r>
-        <w:fldChar w:fldCharType="separate"/>
-      </w:r>
-      <w:r>
-        <w:rPr>
-          <w:rFonts w:ascii="Verdana" w:eastAsia="Verdana" w:hAnsi="Verdana" w:cs="Verdana"/>
-          <w:color w:val="4DB2EC"/>
-          <w:sz w:val="23"/>
-          <w:szCs w:val="23"/>
-        </w:rPr>
-        <w:t>phần mềm Microsoft Teams</w:t>
-      </w:r>
-      <w:r>
-        <w:rPr>
-          <w:rFonts w:ascii="Verdana" w:eastAsia="Verdana" w:hAnsi="Verdana" w:cs="Verdana"/>
-          <w:color w:val="4DB2EC"/>
-          <w:sz w:val="23"/>
-          <w:szCs w:val="23"/>
-        </w:rPr>
-        <w:fldChar w:fldCharType="end"/>
-      </w:r>
+      <w:hyperlink r:id="rId27">
+        <w:r>
+          <w:rPr>
+            <w:rFonts w:ascii="Verdana" w:eastAsia="Verdana" w:hAnsi="Verdana" w:cs="Verdana"/>
+            <w:color w:val="4DB2EC"/>
+            <w:sz w:val="23"/>
+            <w:szCs w:val="23"/>
+          </w:rPr>
+          <w:t>phần mềm Microsoft Teams</w:t>
+        </w:r>
+      </w:hyperlink>
       <w:r>
         <w:rPr>
           <w:rFonts w:ascii="Verdana" w:eastAsia="Verdana" w:hAnsi="Verdana" w:cs="Verdana"/>
@@ -2618,33 +2506,17 @@
         </w:rPr>
         <w:t xml:space="preserve"> và hệ thống moodle </w:t>
       </w:r>
-      <w:r>
-        <w:fldChar w:fldCharType="begin"/>
-      </w:r>
-      <w:r>
-        <w:instrText>HYPERLINK "http://elearning.citd.vn/" \h</w:instrText>
-      </w:r>
-      <w:r>
-        <w:fldChar w:fldCharType="separate"/>
-      </w:r>
-      <w:r>
-        <w:rPr>
-          <w:rFonts w:ascii="Verdana" w:eastAsia="Verdana" w:hAnsi="Verdana" w:cs="Verdana"/>
-          <w:color w:val="4DB2EC"/>
-          <w:sz w:val="23"/>
-          <w:szCs w:val="23"/>
-        </w:rPr>
-        <w:t>elearning.citd.vn</w:t>
-      </w:r>
-      <w:r>
-        <w:rPr>
-          <w:rFonts w:ascii="Verdana" w:eastAsia="Verdana" w:hAnsi="Verdana" w:cs="Verdana"/>
-          <w:color w:val="4DB2EC"/>
-          <w:sz w:val="23"/>
-          <w:szCs w:val="23"/>
-        </w:rPr>
-        <w:fldChar w:fldCharType="end"/>
-      </w:r>
+      <w:hyperlink r:id="rId28">
+        <w:r>
+          <w:rPr>
+            <w:rFonts w:ascii="Verdana" w:eastAsia="Verdana" w:hAnsi="Verdana" w:cs="Verdana"/>
+            <w:color w:val="4DB2EC"/>
+            <w:sz w:val="23"/>
+            <w:szCs w:val="23"/>
+          </w:rPr>
+          <w:t>elearning.citd.vn</w:t>
+        </w:r>
+      </w:hyperlink>
       <w:r>
         <w:rPr>
           <w:color w:val="222222"/>
@@ -2870,7 +2742,7 @@
         </w:rPr>
         <w:t xml:space="preserve">Bạn hoàn toàn có thể kiểm soát thời gian thi của mình bằng cách xem chương trình đào tạo năm của trường để sắp xếp cho phù hợp. </w:t>
       </w:r>
-      <w:hyperlink r:id="rId21">
+      <w:hyperlink r:id="rId29">
         <w:r>
           <w:rPr>
             <w:rFonts w:ascii="Verdana" w:eastAsia="Verdana" w:hAnsi="Verdana" w:cs="Verdana"/>
@@ -2981,33 +2853,17 @@
         </w:rPr>
         <w:t xml:space="preserve">Khi trở thành sinh viên của Trường, bạn sẽ được cấp 01 tài khoản chứng thực của Trường để làm bài tập và học, đọc các tài liệu trên hệ thống moodle </w:t>
       </w:r>
-      <w:r>
-        <w:fldChar w:fldCharType="begin"/>
-      </w:r>
-      <w:r>
-        <w:instrText>HYPERLINK "http://elearning.citd.vn/" \h</w:instrText>
-      </w:r>
-      <w:r>
-        <w:fldChar w:fldCharType="separate"/>
-      </w:r>
-      <w:r>
-        <w:rPr>
-          <w:rFonts w:ascii="Verdana" w:eastAsia="Verdana" w:hAnsi="Verdana" w:cs="Verdana"/>
-          <w:color w:val="4DB2EC"/>
-          <w:sz w:val="23"/>
-          <w:szCs w:val="23"/>
-        </w:rPr>
-        <w:t>elearning.citd.vn</w:t>
-      </w:r>
-      <w:r>
-        <w:rPr>
-          <w:rFonts w:ascii="Verdana" w:eastAsia="Verdana" w:hAnsi="Verdana" w:cs="Verdana"/>
-          <w:color w:val="4DB2EC"/>
-          <w:sz w:val="23"/>
-          <w:szCs w:val="23"/>
-        </w:rPr>
-        <w:fldChar w:fldCharType="end"/>
-      </w:r>
+      <w:hyperlink r:id="rId30">
+        <w:r>
+          <w:rPr>
+            <w:rFonts w:ascii="Verdana" w:eastAsia="Verdana" w:hAnsi="Verdana" w:cs="Verdana"/>
+            <w:color w:val="4DB2EC"/>
+            <w:sz w:val="23"/>
+            <w:szCs w:val="23"/>
+          </w:rPr>
+          <w:t>elearning.citd.vn</w:t>
+        </w:r>
+      </w:hyperlink>
       <w:r>
         <w:rPr>
           <w:color w:val="222222"/>
@@ -3254,7 +3110,7 @@
         </w:rPr>
         <w:t xml:space="preserve">Trung tâm có mục hướng dẫn cách sử dụng các hệ thống, phần mềm học trực tuyến và sử dụng tối ưu các tài nguyên do Trường cung cấp tại mục Hỗ trợ sinh viên, phần Công cụ học tập </w:t>
       </w:r>
-      <w:hyperlink r:id="rId22">
+      <w:hyperlink r:id="rId31">
         <w:r>
           <w:rPr>
             <w:rFonts w:ascii="Verdana" w:eastAsia="Verdana" w:hAnsi="Verdana" w:cs="Verdana"/>
@@ -3309,33 +3165,17 @@
         </w:rPr>
         <w:t xml:space="preserve">Trung tâm có mục hướng dẫn sinh viên quy trình nhập học, thu học phí, khai báo hồ sơ tại mục Hỗ trợ sinh viên, phần Quy trình, biểu mẫu cho sinh viên </w:t>
       </w:r>
-      <w:r>
-        <w:fldChar w:fldCharType="begin"/>
-      </w:r>
-      <w:r>
-        <w:instrText>HYPERLINK "https://www.citd.vn/quy-trinh-bieu-mau-cho-sinh-vien/" \h</w:instrText>
-      </w:r>
-      <w:r>
-        <w:fldChar w:fldCharType="separate"/>
-      </w:r>
-      <w:r>
-        <w:rPr>
-          <w:rFonts w:ascii="Verdana" w:eastAsia="Verdana" w:hAnsi="Verdana" w:cs="Verdana"/>
-          <w:color w:val="4DB2EC"/>
-          <w:sz w:val="23"/>
-          <w:szCs w:val="23"/>
-        </w:rPr>
-        <w:t>https://www.citd.vn/quy-trinh-bieu-mau-cho-sinh-vien/</w:t>
-      </w:r>
-      <w:r>
-        <w:rPr>
-          <w:rFonts w:ascii="Verdana" w:eastAsia="Verdana" w:hAnsi="Verdana" w:cs="Verdana"/>
-          <w:color w:val="4DB2EC"/>
-          <w:sz w:val="23"/>
-          <w:szCs w:val="23"/>
-        </w:rPr>
-        <w:fldChar w:fldCharType="end"/>
-      </w:r>
+      <w:hyperlink r:id="rId32">
+        <w:r>
+          <w:rPr>
+            <w:rFonts w:ascii="Verdana" w:eastAsia="Verdana" w:hAnsi="Verdana" w:cs="Verdana"/>
+            <w:color w:val="4DB2EC"/>
+            <w:sz w:val="23"/>
+            <w:szCs w:val="23"/>
+          </w:rPr>
+          <w:t>https://www.citd.vn/quy-trinh-bieu-mau-cho-sinh-vien/</w:t>
+        </w:r>
+      </w:hyperlink>
     </w:p>
     <w:p>
       <w:pPr>
@@ -4679,12 +4519,11 @@
           <w:szCs w:val="41"/>
           <w:lang w:val="en-US"/>
         </w:rPr>
-        <w:t xml:space="preserve">Link </w:t>
-      </w:r>
-      <w:proofErr w:type="spellStart"/>
-      <w:r>
-        <w:rPr>
-          <w:rFonts w:ascii="Roboto" w:eastAsia="Roboto" w:hAnsi="Roboto" w:cs="Roboto"/>
+        <w:t>Link th</w:t>
+      </w:r>
+      <w:r>
+        <w:rPr>
+          <w:rFonts w:ascii="Cambria" w:eastAsia="Roboto" w:hAnsi="Cambria" w:cs="Roboto"/>
           <w:b/>
           <w:bCs/>
           <w:color w:val="3366FF"/>
@@ -4692,60 +4531,9 @@
           <w:szCs w:val="41"/>
           <w:lang w:val="en-US"/>
         </w:rPr>
-        <w:t>th</w:t>
-      </w:r>
-      <w:r>
-        <w:rPr>
-          <w:rFonts w:ascii="Cambria" w:eastAsia="Roboto" w:hAnsi="Cambria" w:cs="Roboto"/>
-          <w:b/>
-          <w:bCs/>
-          <w:color w:val="3366FF"/>
-          <w:sz w:val="41"/>
-          <w:szCs w:val="41"/>
-          <w:lang w:val="en-US"/>
-        </w:rPr>
-        <w:t>am</w:t>
-      </w:r>
-      <w:proofErr w:type="spellEnd"/>
-      <w:r>
-        <w:rPr>
-          <w:rFonts w:ascii="Cambria" w:eastAsia="Roboto" w:hAnsi="Cambria" w:cs="Roboto"/>
-          <w:b/>
-          <w:bCs/>
-          <w:color w:val="3366FF"/>
-          <w:sz w:val="41"/>
-          <w:szCs w:val="41"/>
-          <w:lang w:val="en-US"/>
-        </w:rPr>
-        <w:t xml:space="preserve"> </w:t>
-      </w:r>
-      <w:proofErr w:type="spellStart"/>
-      <w:r>
-        <w:rPr>
-          <w:rFonts w:ascii="Cambria" w:eastAsia="Roboto" w:hAnsi="Cambria" w:cs="Roboto"/>
-          <w:b/>
-          <w:bCs/>
-          <w:color w:val="3366FF"/>
-          <w:sz w:val="41"/>
-          <w:szCs w:val="41"/>
-          <w:lang w:val="en-US"/>
-        </w:rPr>
-        <w:t>khảo</w:t>
-      </w:r>
-      <w:proofErr w:type="spellEnd"/>
-      <w:r>
-        <w:rPr>
-          <w:rFonts w:ascii="Cambria" w:eastAsia="Roboto" w:hAnsi="Cambria" w:cs="Roboto"/>
-          <w:b/>
-          <w:bCs/>
-          <w:color w:val="3366FF"/>
-          <w:sz w:val="41"/>
-          <w:szCs w:val="41"/>
-          <w:lang w:val="en-US"/>
-        </w:rPr>
-        <w:t xml:space="preserve">: </w:t>
-      </w:r>
-      <w:hyperlink r:id="rId23" w:history="1">
+        <w:t xml:space="preserve">am khảo: </w:t>
+      </w:r>
+      <w:hyperlink r:id="rId33" w:history="1">
         <w:r>
           <w:rPr>
             <w:rStyle w:val="Hyperlink"/>
@@ -4870,61 +4658,9 @@
           <w:szCs w:val="41"/>
           <w:lang w:val="en-US"/>
         </w:rPr>
-        <w:t xml:space="preserve">Link </w:t>
-      </w:r>
-      <w:proofErr w:type="spellStart"/>
-      <w:r>
-        <w:rPr>
-          <w:rFonts w:ascii="Cambria" w:eastAsia="Roboto" w:hAnsi="Cambria" w:cs="Roboto"/>
-          <w:b/>
-          <w:bCs/>
-          <w:color w:val="3366FF"/>
-          <w:sz w:val="41"/>
-          <w:szCs w:val="41"/>
-          <w:lang w:val="en-US"/>
-        </w:rPr>
-        <w:t>tham</w:t>
-      </w:r>
-      <w:proofErr w:type="spellEnd"/>
-      <w:r>
-        <w:rPr>
-          <w:rFonts w:ascii="Cambria" w:eastAsia="Roboto" w:hAnsi="Cambria" w:cs="Roboto"/>
-          <w:b/>
-          <w:bCs/>
-          <w:color w:val="3366FF"/>
-          <w:sz w:val="41"/>
-          <w:szCs w:val="41"/>
-          <w:lang w:val="en-US"/>
-        </w:rPr>
-        <w:t xml:space="preserve"> </w:t>
-      </w:r>
-      <w:proofErr w:type="spellStart"/>
-      <w:r>
-        <w:rPr>
-          <w:rFonts w:ascii="Cambria" w:eastAsia="Roboto" w:hAnsi="Cambria" w:cs="Roboto"/>
-          <w:b/>
-          <w:bCs/>
-          <w:color w:val="3366FF"/>
-          <w:sz w:val="41"/>
-          <w:szCs w:val="41"/>
-          <w:lang w:val="en-US"/>
-        </w:rPr>
-        <w:t>khảo</w:t>
-      </w:r>
-      <w:proofErr w:type="spellEnd"/>
-      <w:r>
-        <w:rPr>
-          <w:rFonts w:ascii="Cambria" w:eastAsia="Roboto" w:hAnsi="Cambria" w:cs="Roboto"/>
-          <w:b/>
-          <w:bCs/>
-          <w:color w:val="3366FF"/>
-          <w:sz w:val="41"/>
-          <w:szCs w:val="41"/>
-          <w:lang w:val="en-US"/>
-        </w:rPr>
-        <w:t xml:space="preserve">: </w:t>
-      </w:r>
-      <w:hyperlink r:id="rId24" w:history="1">
+        <w:t xml:space="preserve">Link tham khảo: </w:t>
+      </w:r>
+      <w:hyperlink r:id="rId34" w:history="1">
         <w:r>
           <w:rPr>
             <w:rStyle w:val="Hyperlink"/>
@@ -5050,61 +4786,9 @@
           <w:szCs w:val="41"/>
           <w:lang w:val="en-US"/>
         </w:rPr>
-        <w:t xml:space="preserve">Link </w:t>
-      </w:r>
-      <w:proofErr w:type="spellStart"/>
-      <w:r>
-        <w:rPr>
-          <w:rFonts w:ascii="Cambria" w:eastAsia="Roboto" w:hAnsi="Cambria" w:cs="Roboto"/>
-          <w:b/>
-          <w:bCs/>
-          <w:color w:val="3366FF"/>
-          <w:sz w:val="41"/>
-          <w:szCs w:val="41"/>
-          <w:lang w:val="en-US"/>
-        </w:rPr>
-        <w:t>tham</w:t>
-      </w:r>
-      <w:proofErr w:type="spellEnd"/>
-      <w:r>
-        <w:rPr>
-          <w:rFonts w:ascii="Cambria" w:eastAsia="Roboto" w:hAnsi="Cambria" w:cs="Roboto"/>
-          <w:b/>
-          <w:bCs/>
-          <w:color w:val="3366FF"/>
-          <w:sz w:val="41"/>
-          <w:szCs w:val="41"/>
-          <w:lang w:val="en-US"/>
-        </w:rPr>
-        <w:t xml:space="preserve"> </w:t>
-      </w:r>
-      <w:proofErr w:type="spellStart"/>
-      <w:r>
-        <w:rPr>
-          <w:rFonts w:ascii="Cambria" w:eastAsia="Roboto" w:hAnsi="Cambria" w:cs="Roboto"/>
-          <w:b/>
-          <w:bCs/>
-          <w:color w:val="3366FF"/>
-          <w:sz w:val="41"/>
-          <w:szCs w:val="41"/>
-          <w:lang w:val="en-US"/>
-        </w:rPr>
-        <w:t>khảo</w:t>
-      </w:r>
-      <w:proofErr w:type="spellEnd"/>
-      <w:r>
-        <w:rPr>
-          <w:rFonts w:ascii="Cambria" w:eastAsia="Roboto" w:hAnsi="Cambria" w:cs="Roboto"/>
-          <w:b/>
-          <w:bCs/>
-          <w:color w:val="3366FF"/>
-          <w:sz w:val="41"/>
-          <w:szCs w:val="41"/>
-          <w:lang w:val="en-US"/>
-        </w:rPr>
-        <w:t xml:space="preserve">: </w:t>
-      </w:r>
-      <w:hyperlink r:id="rId25" w:history="1">
+        <w:t xml:space="preserve">Link tham khảo: </w:t>
+      </w:r>
+      <w:hyperlink r:id="rId35" w:history="1">
         <w:r>
           <w:rPr>
             <w:rStyle w:val="Hyperlink"/>
@@ -5207,7 +4891,112 @@
           <w:szCs w:val="41"/>
           <w:lang w:val="en-US"/>
         </w:rPr>
+        <w:t xml:space="preserve">29. </w:t>
+      </w:r>
+      <w:r>
+        <w:rPr>
+          <w:rFonts w:ascii="Cambria" w:eastAsia="Roboto" w:hAnsi="Cambria" w:cs="Roboto"/>
+          <w:b/>
+          <w:bCs/>
+          <w:color w:val="3366FF"/>
+          <w:sz w:val="41"/>
+          <w:szCs w:val="41"/>
+          <w:lang w:val="en-US"/>
+        </w:rPr>
+        <w:t>Điểm rèn luyện tối thiểu để đủ điều kiện tốt nghiệp</w:t>
+      </w:r>
+    </w:p>
+    <w:p>
+      <w:pPr>
+        <w:shd w:val="clear" w:color="auto" w:fill="FFFFFF"/>
+        <w:spacing w:after="400"/>
+        <w:rPr>
+          <w:rFonts w:ascii="Cambria" w:eastAsia="Roboto" w:hAnsi="Cambria" w:cs="Roboto"/>
+          <w:b/>
+          <w:bCs/>
+          <w:color w:val="3366FF"/>
+          <w:sz w:val="41"/>
+          <w:szCs w:val="41"/>
+          <w:lang w:val="en-US"/>
+        </w:rPr>
+      </w:pPr>
+      <w:r>
+        <w:rPr>
+          <w:rFonts w:ascii="Cambria" w:eastAsia="Roboto" w:hAnsi="Cambria" w:cs="Roboto"/>
+          <w:b/>
+          <w:bCs/>
+          <w:color w:val="3366FF"/>
+          <w:sz w:val="41"/>
+          <w:szCs w:val="41"/>
+          <w:lang w:val="en-US"/>
+        </w:rPr>
         <w:lastRenderedPageBreak/>
+        <w:t xml:space="preserve">Theo quy chế đào tạo hiện hành mà CTĐT từ xa dẫn chiếu, ngưỡng điểm rèn luyện tích lũy tối thiểu để xét cấp bằng là 50 điểm. Nếu điểm rèn luyện toàn khóa dưới 75 điểm, xếp loại tốt nghiệp có thể bị giảm 1 bậc. Tuy vậy, quy chế chấm điểm rèn luyện public của UIT hiện ghi phạm vi áp dụng cho hệ chính quy, nên với hệ từ xa chỉ nên khẳng định chắc ngưỡng dùng trong xét tốt nghiệp; còn cơ chế chấm cụ thể cần hỏi thêm đơn vị quản lý nếu cần triển khai nghiệp vụ. </w:t>
+      </w:r>
+    </w:p>
+    <w:p>
+      <w:pPr>
+        <w:shd w:val="clear" w:color="auto" w:fill="FFFFFF"/>
+        <w:spacing w:after="400"/>
+        <w:rPr>
+          <w:rFonts w:ascii="Cambria" w:eastAsia="Roboto" w:hAnsi="Cambria" w:cs="Roboto"/>
+          <w:b/>
+          <w:bCs/>
+          <w:color w:val="3366FF"/>
+          <w:sz w:val="41"/>
+          <w:szCs w:val="41"/>
+          <w:lang w:val="en-US"/>
+        </w:rPr>
+      </w:pPr>
+      <w:r>
+        <w:rPr>
+          <w:rFonts w:ascii="Cambria" w:eastAsia="Roboto" w:hAnsi="Cambria" w:cs="Roboto"/>
+          <w:b/>
+          <w:bCs/>
+          <w:color w:val="3366FF"/>
+          <w:sz w:val="41"/>
+          <w:szCs w:val="41"/>
+          <w:lang w:val="en-US"/>
+        </w:rPr>
+        <w:t xml:space="preserve">Theo quy chế </w:t>
+      </w:r>
+      <w:r>
+        <w:rPr>
+          <w:rFonts w:ascii="Cambria" w:eastAsia="Roboto" w:hAnsi="Cambria" w:cs="Roboto"/>
+          <w:b/>
+          <w:bCs/>
+          <w:color w:val="3366FF"/>
+          <w:sz w:val="41"/>
+          <w:szCs w:val="41"/>
+          <w:lang w:val="en-US"/>
+        </w:rPr>
+        <w:t>790-qd-dhcntt_28-9-22_quy_che_dao_tao</w:t>
+      </w:r>
+    </w:p>
+    <w:p>
+      <w:pPr>
+        <w:shd w:val="clear" w:color="auto" w:fill="FFFFFF"/>
+        <w:spacing w:after="400"/>
+        <w:rPr>
+          <w:rFonts w:ascii="Cambria" w:eastAsia="Roboto" w:hAnsi="Cambria" w:cs="Roboto"/>
+          <w:b/>
+          <w:bCs/>
+          <w:color w:val="3366FF"/>
+          <w:sz w:val="41"/>
+          <w:szCs w:val="41"/>
+          <w:lang w:val="en-US"/>
+        </w:rPr>
+      </w:pPr>
+      <w:r>
+        <w:rPr>
+          <w:rFonts w:ascii="Cambria" w:eastAsia="Roboto" w:hAnsi="Cambria" w:cs="Roboto"/>
+          <w:b/>
+          <w:bCs/>
+          <w:color w:val="3366FF"/>
+          <w:sz w:val="41"/>
+          <w:szCs w:val="41"/>
+          <w:lang w:val="en-US"/>
+        </w:rPr>
         <w:t>Link:</w:t>
       </w:r>
       <w:r>
@@ -5292,813 +5081,7 @@
           <w:szCs w:val="41"/>
           <w:lang w:val="en-US"/>
         </w:rPr>
-        <w:t xml:space="preserve">Quy </w:t>
-      </w:r>
-      <w:proofErr w:type="spellStart"/>
-      <w:r>
-        <w:rPr>
-          <w:rFonts w:ascii="Cambria" w:eastAsia="Roboto" w:hAnsi="Cambria" w:cs="Roboto"/>
-          <w:b/>
-          <w:bCs/>
-          <w:color w:val="3366FF"/>
-          <w:sz w:val="41"/>
-          <w:szCs w:val="41"/>
-          <w:lang w:val="en-US"/>
-        </w:rPr>
-        <w:t>định</w:t>
-      </w:r>
-      <w:proofErr w:type="spellEnd"/>
-      <w:r>
-        <w:rPr>
-          <w:rFonts w:ascii="Cambria" w:eastAsia="Roboto" w:hAnsi="Cambria" w:cs="Roboto"/>
-          <w:b/>
-          <w:bCs/>
-          <w:color w:val="3366FF"/>
-          <w:sz w:val="41"/>
-          <w:szCs w:val="41"/>
-          <w:lang w:val="en-US"/>
-        </w:rPr>
-        <w:t xml:space="preserve"> </w:t>
-      </w:r>
-      <w:proofErr w:type="spellStart"/>
-      <w:r>
-        <w:rPr>
-          <w:rFonts w:ascii="Cambria" w:eastAsia="Roboto" w:hAnsi="Cambria" w:cs="Roboto"/>
-          <w:b/>
-          <w:bCs/>
-          <w:color w:val="3366FF"/>
-          <w:sz w:val="41"/>
-          <w:szCs w:val="41"/>
-          <w:lang w:val="en-US"/>
-        </w:rPr>
-        <w:t>về</w:t>
-      </w:r>
-      <w:proofErr w:type="spellEnd"/>
-      <w:r>
-        <w:rPr>
-          <w:rFonts w:ascii="Cambria" w:eastAsia="Roboto" w:hAnsi="Cambria" w:cs="Roboto"/>
-          <w:b/>
-          <w:bCs/>
-          <w:color w:val="3366FF"/>
-          <w:sz w:val="41"/>
-          <w:szCs w:val="41"/>
-          <w:lang w:val="en-US"/>
-        </w:rPr>
-        <w:t xml:space="preserve"> </w:t>
-      </w:r>
-      <w:proofErr w:type="spellStart"/>
-      <w:r>
-        <w:rPr>
-          <w:rFonts w:ascii="Cambria" w:eastAsia="Roboto" w:hAnsi="Cambria" w:cs="Roboto"/>
-          <w:b/>
-          <w:bCs/>
-          <w:color w:val="3366FF"/>
-          <w:sz w:val="41"/>
-          <w:szCs w:val="41"/>
-          <w:lang w:val="en-US"/>
-        </w:rPr>
-        <w:t>thời</w:t>
-      </w:r>
-      <w:proofErr w:type="spellEnd"/>
-      <w:r>
-        <w:rPr>
-          <w:rFonts w:ascii="Cambria" w:eastAsia="Roboto" w:hAnsi="Cambria" w:cs="Roboto"/>
-          <w:b/>
-          <w:bCs/>
-          <w:color w:val="3366FF"/>
-          <w:sz w:val="41"/>
-          <w:szCs w:val="41"/>
-          <w:lang w:val="en-US"/>
-        </w:rPr>
-        <w:t xml:space="preserve"> </w:t>
-      </w:r>
-      <w:proofErr w:type="spellStart"/>
-      <w:r>
-        <w:rPr>
-          <w:rFonts w:ascii="Cambria" w:eastAsia="Roboto" w:hAnsi="Cambria" w:cs="Roboto"/>
-          <w:b/>
-          <w:bCs/>
-          <w:color w:val="3366FF"/>
-          <w:sz w:val="41"/>
-          <w:szCs w:val="41"/>
-          <w:lang w:val="en-US"/>
-        </w:rPr>
-        <w:t>gian</w:t>
-      </w:r>
-      <w:proofErr w:type="spellEnd"/>
-      <w:r>
-        <w:rPr>
-          <w:rFonts w:ascii="Cambria" w:eastAsia="Roboto" w:hAnsi="Cambria" w:cs="Roboto"/>
-          <w:b/>
-          <w:bCs/>
-          <w:color w:val="3366FF"/>
-          <w:sz w:val="41"/>
-          <w:szCs w:val="41"/>
-          <w:lang w:val="en-US"/>
-        </w:rPr>
-        <w:t xml:space="preserve">: SV </w:t>
-      </w:r>
-      <w:proofErr w:type="spellStart"/>
-      <w:r>
-        <w:rPr>
-          <w:rFonts w:ascii="Cambria" w:eastAsia="Roboto" w:hAnsi="Cambria" w:cs="Roboto"/>
-          <w:b/>
-          <w:bCs/>
-          <w:color w:val="3366FF"/>
-          <w:sz w:val="41"/>
-          <w:szCs w:val="41"/>
-          <w:lang w:val="en-US"/>
-        </w:rPr>
-        <w:t>muốn</w:t>
-      </w:r>
-      <w:proofErr w:type="spellEnd"/>
-      <w:r>
-        <w:rPr>
-          <w:rFonts w:ascii="Cambria" w:eastAsia="Roboto" w:hAnsi="Cambria" w:cs="Roboto"/>
-          <w:b/>
-          <w:bCs/>
-          <w:color w:val="3366FF"/>
-          <w:sz w:val="41"/>
-          <w:szCs w:val="41"/>
-          <w:lang w:val="en-US"/>
-        </w:rPr>
-        <w:t xml:space="preserve"> </w:t>
-      </w:r>
-      <w:proofErr w:type="spellStart"/>
-      <w:r>
-        <w:rPr>
-          <w:rFonts w:ascii="Cambria" w:eastAsia="Roboto" w:hAnsi="Cambria" w:cs="Roboto"/>
-          <w:b/>
-          <w:bCs/>
-          <w:color w:val="3366FF"/>
-          <w:sz w:val="41"/>
-          <w:szCs w:val="41"/>
-          <w:lang w:val="en-US"/>
-        </w:rPr>
-        <w:t>đăng</w:t>
-      </w:r>
-      <w:proofErr w:type="spellEnd"/>
-      <w:r>
-        <w:rPr>
-          <w:rFonts w:ascii="Cambria" w:eastAsia="Roboto" w:hAnsi="Cambria" w:cs="Roboto"/>
-          <w:b/>
-          <w:bCs/>
-          <w:color w:val="3366FF"/>
-          <w:sz w:val="41"/>
-          <w:szCs w:val="41"/>
-          <w:lang w:val="en-US"/>
-        </w:rPr>
-        <w:t xml:space="preserve"> </w:t>
-      </w:r>
-      <w:proofErr w:type="spellStart"/>
-      <w:r>
-        <w:rPr>
-          <w:rFonts w:ascii="Cambria" w:eastAsia="Roboto" w:hAnsi="Cambria" w:cs="Roboto"/>
-          <w:b/>
-          <w:bCs/>
-          <w:color w:val="3366FF"/>
-          <w:sz w:val="41"/>
-          <w:szCs w:val="41"/>
-          <w:lang w:val="en-US"/>
-        </w:rPr>
-        <w:t>ký</w:t>
-      </w:r>
-      <w:proofErr w:type="spellEnd"/>
-      <w:r>
-        <w:rPr>
-          <w:rFonts w:ascii="Cambria" w:eastAsia="Roboto" w:hAnsi="Cambria" w:cs="Roboto"/>
-          <w:b/>
-          <w:bCs/>
-          <w:color w:val="3366FF"/>
-          <w:sz w:val="41"/>
-          <w:szCs w:val="41"/>
-          <w:lang w:val="en-US"/>
-        </w:rPr>
-        <w:t xml:space="preserve"> </w:t>
-      </w:r>
-      <w:proofErr w:type="spellStart"/>
-      <w:r>
-        <w:rPr>
-          <w:rFonts w:ascii="Cambria" w:eastAsia="Roboto" w:hAnsi="Cambria" w:cs="Roboto"/>
-          <w:b/>
-          <w:bCs/>
-          <w:color w:val="3366FF"/>
-          <w:sz w:val="41"/>
-          <w:szCs w:val="41"/>
-          <w:lang w:val="en-US"/>
-        </w:rPr>
-        <w:t>học</w:t>
-      </w:r>
-      <w:proofErr w:type="spellEnd"/>
-      <w:r>
-        <w:rPr>
-          <w:rFonts w:ascii="Cambria" w:eastAsia="Roboto" w:hAnsi="Cambria" w:cs="Roboto"/>
-          <w:b/>
-          <w:bCs/>
-          <w:color w:val="3366FF"/>
-          <w:sz w:val="41"/>
-          <w:szCs w:val="41"/>
-          <w:lang w:val="en-US"/>
-        </w:rPr>
-        <w:t xml:space="preserve"> </w:t>
-      </w:r>
-      <w:proofErr w:type="spellStart"/>
-      <w:r>
-        <w:rPr>
-          <w:rFonts w:ascii="Cambria" w:eastAsia="Roboto" w:hAnsi="Cambria" w:cs="Roboto"/>
-          <w:b/>
-          <w:bCs/>
-          <w:color w:val="3366FF"/>
-          <w:sz w:val="41"/>
-          <w:szCs w:val="41"/>
-          <w:lang w:val="en-US"/>
-        </w:rPr>
-        <w:t>lại</w:t>
-      </w:r>
-      <w:proofErr w:type="spellEnd"/>
-      <w:r>
-        <w:rPr>
-          <w:rFonts w:ascii="Cambria" w:eastAsia="Roboto" w:hAnsi="Cambria" w:cs="Roboto"/>
-          <w:b/>
-          <w:bCs/>
-          <w:color w:val="3366FF"/>
-          <w:sz w:val="41"/>
-          <w:szCs w:val="41"/>
-          <w:lang w:val="en-US"/>
-        </w:rPr>
-        <w:t xml:space="preserve">/ </w:t>
-      </w:r>
-      <w:proofErr w:type="spellStart"/>
-      <w:r>
-        <w:rPr>
-          <w:rFonts w:ascii="Cambria" w:eastAsia="Roboto" w:hAnsi="Cambria" w:cs="Roboto"/>
-          <w:b/>
-          <w:bCs/>
-          <w:color w:val="3366FF"/>
-          <w:sz w:val="41"/>
-          <w:szCs w:val="41"/>
-          <w:lang w:val="en-US"/>
-        </w:rPr>
-        <w:t>học</w:t>
-      </w:r>
-      <w:proofErr w:type="spellEnd"/>
-      <w:r>
-        <w:rPr>
-          <w:rFonts w:ascii="Cambria" w:eastAsia="Roboto" w:hAnsi="Cambria" w:cs="Roboto"/>
-          <w:b/>
-          <w:bCs/>
-          <w:color w:val="3366FF"/>
-          <w:sz w:val="41"/>
-          <w:szCs w:val="41"/>
-          <w:lang w:val="en-US"/>
-        </w:rPr>
-        <w:t xml:space="preserve"> </w:t>
-      </w:r>
-      <w:proofErr w:type="spellStart"/>
-      <w:r>
-        <w:rPr>
-          <w:rFonts w:ascii="Cambria" w:eastAsia="Roboto" w:hAnsi="Cambria" w:cs="Roboto"/>
-          <w:b/>
-          <w:bCs/>
-          <w:color w:val="3366FF"/>
-          <w:sz w:val="41"/>
-          <w:szCs w:val="41"/>
-          <w:lang w:val="en-US"/>
-        </w:rPr>
-        <w:t>cải</w:t>
-      </w:r>
-      <w:proofErr w:type="spellEnd"/>
-      <w:r>
-        <w:rPr>
-          <w:rFonts w:ascii="Cambria" w:eastAsia="Roboto" w:hAnsi="Cambria" w:cs="Roboto"/>
-          <w:b/>
-          <w:bCs/>
-          <w:color w:val="3366FF"/>
-          <w:sz w:val="41"/>
-          <w:szCs w:val="41"/>
-          <w:lang w:val="en-US"/>
-        </w:rPr>
-        <w:t xml:space="preserve"> </w:t>
-      </w:r>
-      <w:proofErr w:type="spellStart"/>
-      <w:r>
-        <w:rPr>
-          <w:rFonts w:ascii="Cambria" w:eastAsia="Roboto" w:hAnsi="Cambria" w:cs="Roboto"/>
-          <w:b/>
-          <w:bCs/>
-          <w:color w:val="3366FF"/>
-          <w:sz w:val="41"/>
-          <w:szCs w:val="41"/>
-          <w:lang w:val="en-US"/>
-        </w:rPr>
-        <w:t>thiện</w:t>
-      </w:r>
-      <w:proofErr w:type="spellEnd"/>
-      <w:r>
-        <w:rPr>
-          <w:rFonts w:ascii="Cambria" w:eastAsia="Roboto" w:hAnsi="Cambria" w:cs="Roboto"/>
-          <w:b/>
-          <w:bCs/>
-          <w:color w:val="3366FF"/>
-          <w:sz w:val="41"/>
-          <w:szCs w:val="41"/>
-          <w:lang w:val="en-US"/>
-        </w:rPr>
-        <w:t xml:space="preserve"> </w:t>
-      </w:r>
-      <w:proofErr w:type="spellStart"/>
-      <w:r>
-        <w:rPr>
-          <w:rFonts w:ascii="Cambria" w:eastAsia="Roboto" w:hAnsi="Cambria" w:cs="Roboto"/>
-          <w:b/>
-          <w:bCs/>
-          <w:color w:val="3366FF"/>
-          <w:sz w:val="41"/>
-          <w:szCs w:val="41"/>
-          <w:lang w:val="en-US"/>
-        </w:rPr>
-        <w:t>một</w:t>
-      </w:r>
-      <w:proofErr w:type="spellEnd"/>
-      <w:r>
-        <w:rPr>
-          <w:rFonts w:ascii="Cambria" w:eastAsia="Roboto" w:hAnsi="Cambria" w:cs="Roboto"/>
-          <w:b/>
-          <w:bCs/>
-          <w:color w:val="3366FF"/>
-          <w:sz w:val="41"/>
-          <w:szCs w:val="41"/>
-          <w:lang w:val="en-US"/>
-        </w:rPr>
-        <w:t xml:space="preserve"> </w:t>
-      </w:r>
-      <w:proofErr w:type="spellStart"/>
-      <w:r>
-        <w:rPr>
-          <w:rFonts w:ascii="Cambria" w:eastAsia="Roboto" w:hAnsi="Cambria" w:cs="Roboto"/>
-          <w:b/>
-          <w:bCs/>
-          <w:color w:val="3366FF"/>
-          <w:sz w:val="41"/>
-          <w:szCs w:val="41"/>
-          <w:lang w:val="en-US"/>
-        </w:rPr>
-        <w:t>môn</w:t>
-      </w:r>
-      <w:proofErr w:type="spellEnd"/>
-      <w:r>
-        <w:rPr>
-          <w:rFonts w:ascii="Cambria" w:eastAsia="Roboto" w:hAnsi="Cambria" w:cs="Roboto"/>
-          <w:b/>
-          <w:bCs/>
-          <w:color w:val="3366FF"/>
-          <w:sz w:val="41"/>
-          <w:szCs w:val="41"/>
-          <w:lang w:val="en-US"/>
-        </w:rPr>
-        <w:t xml:space="preserve"> </w:t>
-      </w:r>
-      <w:proofErr w:type="spellStart"/>
-      <w:r>
-        <w:rPr>
-          <w:rFonts w:ascii="Cambria" w:eastAsia="Roboto" w:hAnsi="Cambria" w:cs="Roboto"/>
-          <w:b/>
-          <w:bCs/>
-          <w:color w:val="3366FF"/>
-          <w:sz w:val="41"/>
-          <w:szCs w:val="41"/>
-          <w:lang w:val="en-US"/>
-        </w:rPr>
-        <w:t>học</w:t>
-      </w:r>
-      <w:proofErr w:type="spellEnd"/>
-      <w:r>
-        <w:rPr>
-          <w:rFonts w:ascii="Cambria" w:eastAsia="Roboto" w:hAnsi="Cambria" w:cs="Roboto"/>
-          <w:b/>
-          <w:bCs/>
-          <w:color w:val="3366FF"/>
-          <w:sz w:val="41"/>
-          <w:szCs w:val="41"/>
-          <w:lang w:val="en-US"/>
-        </w:rPr>
-        <w:t xml:space="preserve"> </w:t>
-      </w:r>
-      <w:proofErr w:type="spellStart"/>
-      <w:r>
-        <w:rPr>
-          <w:rFonts w:ascii="Cambria" w:eastAsia="Roboto" w:hAnsi="Cambria" w:cs="Roboto"/>
-          <w:b/>
-          <w:bCs/>
-          <w:color w:val="3366FF"/>
-          <w:sz w:val="41"/>
-          <w:szCs w:val="41"/>
-          <w:lang w:val="en-US"/>
-        </w:rPr>
-        <w:t>phải</w:t>
-      </w:r>
-      <w:proofErr w:type="spellEnd"/>
-      <w:r>
-        <w:rPr>
-          <w:rFonts w:ascii="Cambria" w:eastAsia="Roboto" w:hAnsi="Cambria" w:cs="Roboto"/>
-          <w:b/>
-          <w:bCs/>
-          <w:color w:val="3366FF"/>
-          <w:sz w:val="41"/>
-          <w:szCs w:val="41"/>
-          <w:lang w:val="en-US"/>
-        </w:rPr>
-        <w:t xml:space="preserve"> </w:t>
-      </w:r>
-      <w:proofErr w:type="spellStart"/>
-      <w:r>
-        <w:rPr>
-          <w:rFonts w:ascii="Cambria" w:eastAsia="Roboto" w:hAnsi="Cambria" w:cs="Roboto"/>
-          <w:b/>
-          <w:bCs/>
-          <w:color w:val="3366FF"/>
-          <w:sz w:val="41"/>
-          <w:szCs w:val="41"/>
-          <w:lang w:val="en-US"/>
-        </w:rPr>
-        <w:t>đăng</w:t>
-      </w:r>
-      <w:proofErr w:type="spellEnd"/>
-      <w:r>
-        <w:rPr>
-          <w:rFonts w:ascii="Cambria" w:eastAsia="Roboto" w:hAnsi="Cambria" w:cs="Roboto"/>
-          <w:b/>
-          <w:bCs/>
-          <w:color w:val="3366FF"/>
-          <w:sz w:val="41"/>
-          <w:szCs w:val="41"/>
-          <w:lang w:val="en-US"/>
-        </w:rPr>
-        <w:t xml:space="preserve"> </w:t>
-      </w:r>
-      <w:proofErr w:type="spellStart"/>
-      <w:r>
-        <w:rPr>
-          <w:rFonts w:ascii="Cambria" w:eastAsia="Roboto" w:hAnsi="Cambria" w:cs="Roboto"/>
-          <w:b/>
-          <w:bCs/>
-          <w:color w:val="3366FF"/>
-          <w:sz w:val="41"/>
-          <w:szCs w:val="41"/>
-          <w:lang w:val="en-US"/>
-        </w:rPr>
-        <w:t>ký</w:t>
-      </w:r>
-      <w:proofErr w:type="spellEnd"/>
-      <w:r>
-        <w:rPr>
-          <w:rFonts w:ascii="Cambria" w:eastAsia="Roboto" w:hAnsi="Cambria" w:cs="Roboto"/>
-          <w:b/>
-          <w:bCs/>
-          <w:color w:val="3366FF"/>
-          <w:sz w:val="41"/>
-          <w:szCs w:val="41"/>
-          <w:lang w:val="en-US"/>
-        </w:rPr>
-        <w:t xml:space="preserve"> ở </w:t>
-      </w:r>
-      <w:proofErr w:type="spellStart"/>
-      <w:r>
-        <w:rPr>
-          <w:rFonts w:ascii="Cambria" w:eastAsia="Roboto" w:hAnsi="Cambria" w:cs="Roboto"/>
-          <w:b/>
-          <w:bCs/>
-          <w:color w:val="3366FF"/>
-          <w:sz w:val="41"/>
-          <w:szCs w:val="41"/>
-          <w:lang w:val="en-US"/>
-        </w:rPr>
-        <w:t>học</w:t>
-      </w:r>
-      <w:proofErr w:type="spellEnd"/>
-      <w:r>
-        <w:rPr>
-          <w:rFonts w:ascii="Cambria" w:eastAsia="Roboto" w:hAnsi="Cambria" w:cs="Roboto"/>
-          <w:b/>
-          <w:bCs/>
-          <w:color w:val="3366FF"/>
-          <w:sz w:val="41"/>
-          <w:szCs w:val="41"/>
-          <w:lang w:val="en-US"/>
-        </w:rPr>
-        <w:t xml:space="preserve"> </w:t>
-      </w:r>
-      <w:proofErr w:type="spellStart"/>
-      <w:r>
-        <w:rPr>
-          <w:rFonts w:ascii="Cambria" w:eastAsia="Roboto" w:hAnsi="Cambria" w:cs="Roboto"/>
-          <w:b/>
-          <w:bCs/>
-          <w:color w:val="3366FF"/>
-          <w:sz w:val="41"/>
-          <w:szCs w:val="41"/>
-          <w:lang w:val="en-US"/>
-        </w:rPr>
-        <w:t>kỳ</w:t>
-      </w:r>
-      <w:proofErr w:type="spellEnd"/>
-      <w:r>
-        <w:rPr>
-          <w:rFonts w:ascii="Cambria" w:eastAsia="Roboto" w:hAnsi="Cambria" w:cs="Roboto"/>
-          <w:b/>
-          <w:bCs/>
-          <w:color w:val="3366FF"/>
-          <w:sz w:val="41"/>
-          <w:szCs w:val="41"/>
-          <w:lang w:val="en-US"/>
-        </w:rPr>
-        <w:t> </w:t>
-      </w:r>
-      <w:proofErr w:type="spellStart"/>
-      <w:r>
-        <w:rPr>
-          <w:rFonts w:ascii="Cambria" w:eastAsia="Roboto" w:hAnsi="Cambria" w:cs="Roboto"/>
-          <w:b/>
-          <w:bCs/>
-          <w:color w:val="3366FF"/>
-          <w:sz w:val="41"/>
-          <w:szCs w:val="41"/>
-          <w:lang w:val="en-US"/>
-        </w:rPr>
-        <w:t>cách</w:t>
-      </w:r>
-      <w:proofErr w:type="spellEnd"/>
-      <w:r>
-        <w:rPr>
-          <w:rFonts w:ascii="Cambria" w:eastAsia="Roboto" w:hAnsi="Cambria" w:cs="Roboto"/>
-          <w:b/>
-          <w:bCs/>
-          <w:color w:val="3366FF"/>
-          <w:sz w:val="41"/>
-          <w:szCs w:val="41"/>
-          <w:lang w:val="en-US"/>
-        </w:rPr>
-        <w:t xml:space="preserve"> </w:t>
-      </w:r>
-      <w:proofErr w:type="spellStart"/>
-      <w:r>
-        <w:rPr>
-          <w:rFonts w:ascii="Cambria" w:eastAsia="Roboto" w:hAnsi="Cambria" w:cs="Roboto"/>
-          <w:b/>
-          <w:bCs/>
-          <w:color w:val="3366FF"/>
-          <w:sz w:val="41"/>
-          <w:szCs w:val="41"/>
-          <w:lang w:val="en-US"/>
-        </w:rPr>
-        <w:t>ít</w:t>
-      </w:r>
-      <w:proofErr w:type="spellEnd"/>
-      <w:r>
-        <w:rPr>
-          <w:rFonts w:ascii="Cambria" w:eastAsia="Roboto" w:hAnsi="Cambria" w:cs="Roboto"/>
-          <w:b/>
-          <w:bCs/>
-          <w:color w:val="3366FF"/>
-          <w:sz w:val="41"/>
-          <w:szCs w:val="41"/>
-          <w:lang w:val="en-US"/>
-        </w:rPr>
-        <w:t xml:space="preserve"> </w:t>
-      </w:r>
-      <w:proofErr w:type="spellStart"/>
-      <w:r>
-        <w:rPr>
-          <w:rFonts w:ascii="Cambria" w:eastAsia="Roboto" w:hAnsi="Cambria" w:cs="Roboto"/>
-          <w:b/>
-          <w:bCs/>
-          <w:color w:val="3366FF"/>
-          <w:sz w:val="41"/>
-          <w:szCs w:val="41"/>
-          <w:lang w:val="en-US"/>
-        </w:rPr>
-        <w:t>nhất</w:t>
-      </w:r>
-      <w:proofErr w:type="spellEnd"/>
-      <w:r>
-        <w:rPr>
-          <w:rFonts w:ascii="Cambria" w:eastAsia="Roboto" w:hAnsi="Cambria" w:cs="Roboto"/>
-          <w:b/>
-          <w:bCs/>
-          <w:color w:val="3366FF"/>
-          <w:sz w:val="41"/>
-          <w:szCs w:val="41"/>
-          <w:lang w:val="en-US"/>
-        </w:rPr>
-        <w:t xml:space="preserve"> </w:t>
-      </w:r>
-      <w:proofErr w:type="spellStart"/>
-      <w:r>
-        <w:rPr>
-          <w:rFonts w:ascii="Cambria" w:eastAsia="Roboto" w:hAnsi="Cambria" w:cs="Roboto"/>
-          <w:b/>
-          <w:bCs/>
-          <w:color w:val="3366FF"/>
-          <w:sz w:val="41"/>
-          <w:szCs w:val="41"/>
-          <w:lang w:val="en-US"/>
-        </w:rPr>
-        <w:t>một</w:t>
-      </w:r>
-      <w:proofErr w:type="spellEnd"/>
-      <w:r>
-        <w:rPr>
-          <w:rFonts w:ascii="Cambria" w:eastAsia="Roboto" w:hAnsi="Cambria" w:cs="Roboto"/>
-          <w:b/>
-          <w:bCs/>
-          <w:color w:val="3366FF"/>
-          <w:sz w:val="41"/>
-          <w:szCs w:val="41"/>
-          <w:lang w:val="en-US"/>
-        </w:rPr>
-        <w:t xml:space="preserve"> </w:t>
-      </w:r>
-      <w:proofErr w:type="spellStart"/>
-      <w:r>
-        <w:rPr>
-          <w:rFonts w:ascii="Cambria" w:eastAsia="Roboto" w:hAnsi="Cambria" w:cs="Roboto"/>
-          <w:b/>
-          <w:bCs/>
-          <w:color w:val="3366FF"/>
-          <w:sz w:val="41"/>
-          <w:szCs w:val="41"/>
-          <w:lang w:val="en-US"/>
-        </w:rPr>
-        <w:t>học</w:t>
-      </w:r>
-      <w:proofErr w:type="spellEnd"/>
-      <w:r>
-        <w:rPr>
-          <w:rFonts w:ascii="Cambria" w:eastAsia="Roboto" w:hAnsi="Cambria" w:cs="Roboto"/>
-          <w:b/>
-          <w:bCs/>
-          <w:color w:val="3366FF"/>
-          <w:sz w:val="41"/>
-          <w:szCs w:val="41"/>
-          <w:lang w:val="en-US"/>
-        </w:rPr>
-        <w:t xml:space="preserve"> </w:t>
-      </w:r>
-      <w:proofErr w:type="spellStart"/>
-      <w:r>
-        <w:rPr>
-          <w:rFonts w:ascii="Cambria" w:eastAsia="Roboto" w:hAnsi="Cambria" w:cs="Roboto"/>
-          <w:b/>
-          <w:bCs/>
-          <w:color w:val="3366FF"/>
-          <w:sz w:val="41"/>
-          <w:szCs w:val="41"/>
-          <w:lang w:val="en-US"/>
-        </w:rPr>
-        <w:t>kỳ</w:t>
-      </w:r>
-      <w:proofErr w:type="spellEnd"/>
-      <w:r>
-        <w:rPr>
-          <w:rFonts w:ascii="Cambria" w:eastAsia="Roboto" w:hAnsi="Cambria" w:cs="Roboto"/>
-          <w:b/>
-          <w:bCs/>
-          <w:color w:val="3366FF"/>
-          <w:sz w:val="41"/>
-          <w:szCs w:val="41"/>
-          <w:lang w:val="en-US"/>
-        </w:rPr>
-        <w:t> </w:t>
-      </w:r>
-      <w:proofErr w:type="spellStart"/>
-      <w:r>
-        <w:rPr>
-          <w:rFonts w:ascii="Cambria" w:eastAsia="Roboto" w:hAnsi="Cambria" w:cs="Roboto"/>
-          <w:b/>
-          <w:bCs/>
-          <w:color w:val="3366FF"/>
-          <w:sz w:val="41"/>
-          <w:szCs w:val="41"/>
-          <w:lang w:val="en-US"/>
-        </w:rPr>
-        <w:t>đã</w:t>
-      </w:r>
-      <w:proofErr w:type="spellEnd"/>
-      <w:r>
-        <w:rPr>
-          <w:rFonts w:ascii="Cambria" w:eastAsia="Roboto" w:hAnsi="Cambria" w:cs="Roboto"/>
-          <w:b/>
-          <w:bCs/>
-          <w:color w:val="3366FF"/>
-          <w:sz w:val="41"/>
-          <w:szCs w:val="41"/>
-          <w:lang w:val="en-US"/>
-        </w:rPr>
-        <w:t xml:space="preserve"> </w:t>
-      </w:r>
-      <w:proofErr w:type="spellStart"/>
-      <w:r>
-        <w:rPr>
-          <w:rFonts w:ascii="Cambria" w:eastAsia="Roboto" w:hAnsi="Cambria" w:cs="Roboto"/>
-          <w:b/>
-          <w:bCs/>
-          <w:color w:val="3366FF"/>
-          <w:sz w:val="41"/>
-          <w:szCs w:val="41"/>
-          <w:lang w:val="en-US"/>
-        </w:rPr>
-        <w:t>học</w:t>
-      </w:r>
-      <w:proofErr w:type="spellEnd"/>
-      <w:r>
-        <w:rPr>
-          <w:rFonts w:ascii="Cambria" w:eastAsia="Roboto" w:hAnsi="Cambria" w:cs="Roboto"/>
-          <w:b/>
-          <w:bCs/>
-          <w:color w:val="3366FF"/>
-          <w:sz w:val="41"/>
-          <w:szCs w:val="41"/>
-          <w:lang w:val="en-US"/>
-        </w:rPr>
-        <w:t xml:space="preserve"> </w:t>
-      </w:r>
-      <w:proofErr w:type="spellStart"/>
-      <w:r>
-        <w:rPr>
-          <w:rFonts w:ascii="Cambria" w:eastAsia="Roboto" w:hAnsi="Cambria" w:cs="Roboto"/>
-          <w:b/>
-          <w:bCs/>
-          <w:color w:val="3366FF"/>
-          <w:sz w:val="41"/>
-          <w:szCs w:val="41"/>
-          <w:lang w:val="en-US"/>
-        </w:rPr>
-        <w:t>môn</w:t>
-      </w:r>
-      <w:proofErr w:type="spellEnd"/>
-      <w:r>
-        <w:rPr>
-          <w:rFonts w:ascii="Cambria" w:eastAsia="Roboto" w:hAnsi="Cambria" w:cs="Roboto"/>
-          <w:b/>
-          <w:bCs/>
-          <w:color w:val="3366FF"/>
-          <w:sz w:val="41"/>
-          <w:szCs w:val="41"/>
-          <w:lang w:val="en-US"/>
-        </w:rPr>
-        <w:t xml:space="preserve"> </w:t>
-      </w:r>
-      <w:proofErr w:type="spellStart"/>
-      <w:r>
-        <w:rPr>
-          <w:rFonts w:ascii="Cambria" w:eastAsia="Roboto" w:hAnsi="Cambria" w:cs="Roboto"/>
-          <w:b/>
-          <w:bCs/>
-          <w:color w:val="3366FF"/>
-          <w:sz w:val="41"/>
-          <w:szCs w:val="41"/>
-          <w:lang w:val="en-US"/>
-        </w:rPr>
-        <w:t>học</w:t>
-      </w:r>
-      <w:proofErr w:type="spellEnd"/>
-      <w:r>
-        <w:rPr>
-          <w:rFonts w:ascii="Cambria" w:eastAsia="Roboto" w:hAnsi="Cambria" w:cs="Roboto"/>
-          <w:b/>
-          <w:bCs/>
-          <w:color w:val="3366FF"/>
-          <w:sz w:val="41"/>
-          <w:szCs w:val="41"/>
-          <w:lang w:val="en-US"/>
-        </w:rPr>
-        <w:t xml:space="preserve"> </w:t>
-      </w:r>
-      <w:proofErr w:type="spellStart"/>
-      <w:r>
-        <w:rPr>
-          <w:rFonts w:ascii="Cambria" w:eastAsia="Roboto" w:hAnsi="Cambria" w:cs="Roboto"/>
-          <w:b/>
-          <w:bCs/>
-          <w:color w:val="3366FF"/>
-          <w:sz w:val="41"/>
-          <w:szCs w:val="41"/>
-          <w:lang w:val="en-US"/>
-        </w:rPr>
-        <w:t>đó</w:t>
-      </w:r>
-      <w:proofErr w:type="spellEnd"/>
-      <w:r>
-        <w:rPr>
-          <w:rFonts w:ascii="Cambria" w:eastAsia="Roboto" w:hAnsi="Cambria" w:cs="Roboto"/>
-          <w:b/>
-          <w:bCs/>
-          <w:color w:val="3366FF"/>
-          <w:sz w:val="41"/>
-          <w:szCs w:val="41"/>
-          <w:lang w:val="en-US"/>
-        </w:rPr>
-        <w:t>.</w:t>
+        <w:t>Quy định về thời gian: SV muốn đăng ký học lại/ học cải thiện một môn học phải đăng ký ở học kỳ cách ít nhất một học kỳ đã học môn học đó.</w:t>
       </w:r>
     </w:p>
     <w:p>
@@ -6119,7 +5102,6 @@
           <w:lang w:val="en-US"/>
         </w:rPr>
       </w:pPr>
-      <w:proofErr w:type="spellStart"/>
       <w:r>
         <w:rPr>
           <w:rFonts w:ascii="Cambria" w:eastAsia="Roboto" w:hAnsi="Cambria" w:cs="Roboto"/>
@@ -6132,726 +5114,60 @@
           <w:szCs w:val="41"/>
           <w:lang w:val="en-US"/>
         </w:rPr>
-        <w:t>Ví</w:t>
-      </w:r>
-      <w:proofErr w:type="spellEnd"/>
-      <w:r>
+        <w:lastRenderedPageBreak/>
+        <w:t>Ví dụ: SV học môn Giải tích ở HK1 (2025 – 2026) thì phải đợi đến HK3 (2025 – 2026) mới được đăng ký học lại/ học cải thiện môn này.</w:t>
+      </w:r>
+    </w:p>
+    <w:p>
+      <w:pPr>
+        <w:shd w:val="clear" w:color="auto" w:fill="FFFFFF"/>
+        <w:spacing w:after="400"/>
         <w:rPr>
           <w:rFonts w:ascii="Cambria" w:eastAsia="Roboto" w:hAnsi="Cambria" w:cs="Roboto"/>
           <w:b/>
           <w:bCs/>
-          <w:i/>
-          <w:iCs/>
           <w:color w:val="3366FF"/>
           <w:sz w:val="41"/>
           <w:szCs w:val="41"/>
           <w:lang w:val="en-US"/>
         </w:rPr>
-        <w:t xml:space="preserve"> </w:t>
-      </w:r>
-      <w:proofErr w:type="spellStart"/>
+      </w:pPr>
       <w:r>
         <w:rPr>
           <w:rFonts w:ascii="Cambria" w:eastAsia="Roboto" w:hAnsi="Cambria" w:cs="Roboto"/>
           <w:b/>
           <w:bCs/>
-          <w:i/>
-          <w:iCs/>
           <w:color w:val="3366FF"/>
           <w:sz w:val="41"/>
           <w:szCs w:val="41"/>
           <w:lang w:val="en-US"/>
         </w:rPr>
-        <w:t>dụ</w:t>
-      </w:r>
-      <w:proofErr w:type="spellEnd"/>
+        <w:t xml:space="preserve">Link tham khảo </w:t>
+      </w:r>
       <w:r>
         <w:rPr>
           <w:rFonts w:ascii="Cambria" w:eastAsia="Roboto" w:hAnsi="Cambria" w:cs="Roboto"/>
           <w:b/>
           <w:bCs/>
-          <w:i/>
-          <w:iCs/>
           <w:color w:val="3366FF"/>
           <w:sz w:val="41"/>
           <w:szCs w:val="41"/>
           <w:lang w:val="en-US"/>
         </w:rPr>
-        <w:t xml:space="preserve">: SV </w:t>
-      </w:r>
-      <w:proofErr w:type="spellStart"/>
-      <w:r>
-        <w:rPr>
-          <w:rFonts w:ascii="Cambria" w:eastAsia="Roboto" w:hAnsi="Cambria" w:cs="Roboto"/>
-          <w:b/>
-          <w:bCs/>
-          <w:i/>
-          <w:iCs/>
-          <w:color w:val="3366FF"/>
-          <w:sz w:val="41"/>
-          <w:szCs w:val="41"/>
+        <w:t>https://www.citd.edu.vn/thong-bao-dang-ky-hoc-phan-hoc-lai-hoc-cai-thien-hk2-2025-2026/</w:t>
+      </w:r>
+    </w:p>
+    <w:p>
+      <w:pPr>
+        <w:shd w:val="clear" w:color="auto" w:fill="FFFFFF"/>
+        <w:spacing w:after="400"/>
+        <w:rPr>
+          <w:rFonts w:ascii="Verdana" w:eastAsia="Verdana" w:hAnsi="Verdana" w:cs="Verdana"/>
+          <w:color w:val="222222"/>
+          <w:sz w:val="23"/>
+          <w:szCs w:val="23"/>
           <w:lang w:val="en-US"/>
         </w:rPr>
-        <w:t>học</w:t>
-      </w:r>
-      <w:proofErr w:type="spellEnd"/>
-      <w:r>
-        <w:rPr>
-          <w:rFonts w:ascii="Cambria" w:eastAsia="Roboto" w:hAnsi="Cambria" w:cs="Roboto"/>
-          <w:b/>
-          <w:bCs/>
-          <w:i/>
-          <w:iCs/>
-          <w:color w:val="3366FF"/>
-          <w:sz w:val="41"/>
-          <w:szCs w:val="41"/>
-          <w:lang w:val="en-US"/>
-        </w:rPr>
-        <w:t xml:space="preserve"> </w:t>
-      </w:r>
-      <w:proofErr w:type="spellStart"/>
-      <w:r>
-        <w:rPr>
-          <w:rFonts w:ascii="Cambria" w:eastAsia="Roboto" w:hAnsi="Cambria" w:cs="Roboto"/>
-          <w:b/>
-          <w:bCs/>
-          <w:i/>
-          <w:iCs/>
-          <w:color w:val="3366FF"/>
-          <w:sz w:val="41"/>
-          <w:szCs w:val="41"/>
-          <w:lang w:val="en-US"/>
-        </w:rPr>
-        <w:t>môn</w:t>
-      </w:r>
-      <w:proofErr w:type="spellEnd"/>
-      <w:r>
-        <w:rPr>
-          <w:rFonts w:ascii="Cambria" w:eastAsia="Roboto" w:hAnsi="Cambria" w:cs="Roboto"/>
-          <w:b/>
-          <w:bCs/>
-          <w:i/>
-          <w:iCs/>
-          <w:color w:val="3366FF"/>
-          <w:sz w:val="41"/>
-          <w:szCs w:val="41"/>
-          <w:lang w:val="en-US"/>
-        </w:rPr>
-        <w:t xml:space="preserve"> </w:t>
-      </w:r>
-      <w:proofErr w:type="spellStart"/>
-      <w:r>
-        <w:rPr>
-          <w:rFonts w:ascii="Cambria" w:eastAsia="Roboto" w:hAnsi="Cambria" w:cs="Roboto"/>
-          <w:b/>
-          <w:bCs/>
-          <w:i/>
-          <w:iCs/>
-          <w:color w:val="3366FF"/>
-          <w:sz w:val="41"/>
-          <w:szCs w:val="41"/>
-          <w:lang w:val="en-US"/>
-        </w:rPr>
-        <w:t>Giải</w:t>
-      </w:r>
-      <w:proofErr w:type="spellEnd"/>
-      <w:r>
-        <w:rPr>
-          <w:rFonts w:ascii="Cambria" w:eastAsia="Roboto" w:hAnsi="Cambria" w:cs="Roboto"/>
-          <w:b/>
-          <w:bCs/>
-          <w:i/>
-          <w:iCs/>
-          <w:color w:val="3366FF"/>
-          <w:sz w:val="41"/>
-          <w:szCs w:val="41"/>
-          <w:lang w:val="en-US"/>
-        </w:rPr>
-        <w:t xml:space="preserve"> </w:t>
-      </w:r>
-      <w:proofErr w:type="spellStart"/>
-      <w:r>
-        <w:rPr>
-          <w:rFonts w:ascii="Cambria" w:eastAsia="Roboto" w:hAnsi="Cambria" w:cs="Roboto"/>
-          <w:b/>
-          <w:bCs/>
-          <w:i/>
-          <w:iCs/>
-          <w:color w:val="3366FF"/>
-          <w:sz w:val="41"/>
-          <w:szCs w:val="41"/>
-          <w:lang w:val="en-US"/>
-        </w:rPr>
-        <w:t>tích</w:t>
-      </w:r>
-      <w:proofErr w:type="spellEnd"/>
-      <w:r>
-        <w:rPr>
-          <w:rFonts w:ascii="Cambria" w:eastAsia="Roboto" w:hAnsi="Cambria" w:cs="Roboto"/>
-          <w:b/>
-          <w:bCs/>
-          <w:i/>
-          <w:iCs/>
-          <w:color w:val="3366FF"/>
-          <w:sz w:val="41"/>
-          <w:szCs w:val="41"/>
-          <w:lang w:val="en-US"/>
-        </w:rPr>
-        <w:t xml:space="preserve"> ở HK1 (2025 – 2026) </w:t>
-      </w:r>
-      <w:proofErr w:type="spellStart"/>
-      <w:r>
-        <w:rPr>
-          <w:rFonts w:ascii="Cambria" w:eastAsia="Roboto" w:hAnsi="Cambria" w:cs="Roboto"/>
-          <w:b/>
-          <w:bCs/>
-          <w:i/>
-          <w:iCs/>
-          <w:color w:val="3366FF"/>
-          <w:sz w:val="41"/>
-          <w:szCs w:val="41"/>
-          <w:lang w:val="en-US"/>
-        </w:rPr>
-        <w:t>thì</w:t>
-      </w:r>
-      <w:proofErr w:type="spellEnd"/>
-      <w:r>
-        <w:rPr>
-          <w:rFonts w:ascii="Cambria" w:eastAsia="Roboto" w:hAnsi="Cambria" w:cs="Roboto"/>
-          <w:b/>
-          <w:bCs/>
-          <w:i/>
-          <w:iCs/>
-          <w:color w:val="3366FF"/>
-          <w:sz w:val="41"/>
-          <w:szCs w:val="41"/>
-          <w:lang w:val="en-US"/>
-        </w:rPr>
-        <w:t xml:space="preserve"> </w:t>
-      </w:r>
-      <w:proofErr w:type="spellStart"/>
-      <w:r>
-        <w:rPr>
-          <w:rFonts w:ascii="Cambria" w:eastAsia="Roboto" w:hAnsi="Cambria" w:cs="Roboto"/>
-          <w:b/>
-          <w:bCs/>
-          <w:i/>
-          <w:iCs/>
-          <w:color w:val="3366FF"/>
-          <w:sz w:val="41"/>
-          <w:szCs w:val="41"/>
-          <w:lang w:val="en-US"/>
-        </w:rPr>
-        <w:t>phải</w:t>
-      </w:r>
-      <w:proofErr w:type="spellEnd"/>
-      <w:r>
-        <w:rPr>
-          <w:rFonts w:ascii="Cambria" w:eastAsia="Roboto" w:hAnsi="Cambria" w:cs="Roboto"/>
-          <w:b/>
-          <w:bCs/>
-          <w:i/>
-          <w:iCs/>
-          <w:color w:val="3366FF"/>
-          <w:sz w:val="41"/>
-          <w:szCs w:val="41"/>
-          <w:lang w:val="en-US"/>
-        </w:rPr>
-        <w:t xml:space="preserve"> </w:t>
-      </w:r>
-      <w:proofErr w:type="spellStart"/>
-      <w:r>
-        <w:rPr>
-          <w:rFonts w:ascii="Cambria" w:eastAsia="Roboto" w:hAnsi="Cambria" w:cs="Roboto"/>
-          <w:b/>
-          <w:bCs/>
-          <w:i/>
-          <w:iCs/>
-          <w:color w:val="3366FF"/>
-          <w:sz w:val="41"/>
-          <w:szCs w:val="41"/>
-          <w:lang w:val="en-US"/>
-        </w:rPr>
-        <w:t>đợi</w:t>
-      </w:r>
-      <w:proofErr w:type="spellEnd"/>
-      <w:r>
-        <w:rPr>
-          <w:rFonts w:ascii="Cambria" w:eastAsia="Roboto" w:hAnsi="Cambria" w:cs="Roboto"/>
-          <w:b/>
-          <w:bCs/>
-          <w:i/>
-          <w:iCs/>
-          <w:color w:val="3366FF"/>
-          <w:sz w:val="41"/>
-          <w:szCs w:val="41"/>
-          <w:lang w:val="en-US"/>
-        </w:rPr>
-        <w:t xml:space="preserve"> </w:t>
-      </w:r>
-      <w:proofErr w:type="spellStart"/>
-      <w:r>
-        <w:rPr>
-          <w:rFonts w:ascii="Cambria" w:eastAsia="Roboto" w:hAnsi="Cambria" w:cs="Roboto"/>
-          <w:b/>
-          <w:bCs/>
-          <w:i/>
-          <w:iCs/>
-          <w:color w:val="3366FF"/>
-          <w:sz w:val="41"/>
-          <w:szCs w:val="41"/>
-          <w:lang w:val="en-US"/>
-        </w:rPr>
-        <w:t>đến</w:t>
-      </w:r>
-      <w:proofErr w:type="spellEnd"/>
-      <w:r>
-        <w:rPr>
-          <w:rFonts w:ascii="Cambria" w:eastAsia="Roboto" w:hAnsi="Cambria" w:cs="Roboto"/>
-          <w:b/>
-          <w:bCs/>
-          <w:i/>
-          <w:iCs/>
-          <w:color w:val="3366FF"/>
-          <w:sz w:val="41"/>
-          <w:szCs w:val="41"/>
-          <w:lang w:val="en-US"/>
-        </w:rPr>
-        <w:t xml:space="preserve"> HK3 (2025 – 2026) </w:t>
-      </w:r>
-      <w:proofErr w:type="spellStart"/>
-      <w:r>
-        <w:rPr>
-          <w:rFonts w:ascii="Cambria" w:eastAsia="Roboto" w:hAnsi="Cambria" w:cs="Roboto"/>
-          <w:b/>
-          <w:bCs/>
-          <w:i/>
-          <w:iCs/>
-          <w:color w:val="3366FF"/>
-          <w:sz w:val="41"/>
-          <w:szCs w:val="41"/>
-          <w:lang w:val="en-US"/>
-        </w:rPr>
-        <w:t>mới</w:t>
-      </w:r>
-      <w:proofErr w:type="spellEnd"/>
-      <w:r>
-        <w:rPr>
-          <w:rFonts w:ascii="Cambria" w:eastAsia="Roboto" w:hAnsi="Cambria" w:cs="Roboto"/>
-          <w:b/>
-          <w:bCs/>
-          <w:i/>
-          <w:iCs/>
-          <w:color w:val="3366FF"/>
-          <w:sz w:val="41"/>
-          <w:szCs w:val="41"/>
-          <w:lang w:val="en-US"/>
-        </w:rPr>
-        <w:t xml:space="preserve"> </w:t>
-      </w:r>
-      <w:proofErr w:type="spellStart"/>
-      <w:r>
-        <w:rPr>
-          <w:rFonts w:ascii="Cambria" w:eastAsia="Roboto" w:hAnsi="Cambria" w:cs="Roboto"/>
-          <w:b/>
-          <w:bCs/>
-          <w:i/>
-          <w:iCs/>
-          <w:color w:val="3366FF"/>
-          <w:sz w:val="41"/>
-          <w:szCs w:val="41"/>
-          <w:lang w:val="en-US"/>
-        </w:rPr>
-        <w:t>được</w:t>
-      </w:r>
-      <w:proofErr w:type="spellEnd"/>
-      <w:r>
-        <w:rPr>
-          <w:rFonts w:ascii="Cambria" w:eastAsia="Roboto" w:hAnsi="Cambria" w:cs="Roboto"/>
-          <w:b/>
-          <w:bCs/>
-          <w:i/>
-          <w:iCs/>
-          <w:color w:val="3366FF"/>
-          <w:sz w:val="41"/>
-          <w:szCs w:val="41"/>
-          <w:lang w:val="en-US"/>
-        </w:rPr>
-        <w:t xml:space="preserve"> </w:t>
-      </w:r>
-      <w:proofErr w:type="spellStart"/>
-      <w:r>
-        <w:rPr>
-          <w:rFonts w:ascii="Cambria" w:eastAsia="Roboto" w:hAnsi="Cambria" w:cs="Roboto"/>
-          <w:b/>
-          <w:bCs/>
-          <w:i/>
-          <w:iCs/>
-          <w:color w:val="3366FF"/>
-          <w:sz w:val="41"/>
-          <w:szCs w:val="41"/>
-          <w:lang w:val="en-US"/>
-        </w:rPr>
-        <w:t>đăng</w:t>
-      </w:r>
-      <w:proofErr w:type="spellEnd"/>
-      <w:r>
-        <w:rPr>
-          <w:rFonts w:ascii="Cambria" w:eastAsia="Roboto" w:hAnsi="Cambria" w:cs="Roboto"/>
-          <w:b/>
-          <w:bCs/>
-          <w:i/>
-          <w:iCs/>
-          <w:color w:val="3366FF"/>
-          <w:sz w:val="41"/>
-          <w:szCs w:val="41"/>
-          <w:lang w:val="en-US"/>
-        </w:rPr>
-        <w:t xml:space="preserve"> </w:t>
-      </w:r>
-      <w:proofErr w:type="spellStart"/>
-      <w:r>
-        <w:rPr>
-          <w:rFonts w:ascii="Cambria" w:eastAsia="Roboto" w:hAnsi="Cambria" w:cs="Roboto"/>
-          <w:b/>
-          <w:bCs/>
-          <w:i/>
-          <w:iCs/>
-          <w:color w:val="3366FF"/>
-          <w:sz w:val="41"/>
-          <w:szCs w:val="41"/>
-          <w:lang w:val="en-US"/>
-        </w:rPr>
-        <w:t>ký</w:t>
-      </w:r>
-      <w:proofErr w:type="spellEnd"/>
-      <w:r>
-        <w:rPr>
-          <w:rFonts w:ascii="Cambria" w:eastAsia="Roboto" w:hAnsi="Cambria" w:cs="Roboto"/>
-          <w:b/>
-          <w:bCs/>
-          <w:i/>
-          <w:iCs/>
-          <w:color w:val="3366FF"/>
-          <w:sz w:val="41"/>
-          <w:szCs w:val="41"/>
-          <w:lang w:val="en-US"/>
-        </w:rPr>
-        <w:t xml:space="preserve"> </w:t>
-      </w:r>
-      <w:proofErr w:type="spellStart"/>
-      <w:r>
-        <w:rPr>
-          <w:rFonts w:ascii="Cambria" w:eastAsia="Roboto" w:hAnsi="Cambria" w:cs="Roboto"/>
-          <w:b/>
-          <w:bCs/>
-          <w:i/>
-          <w:iCs/>
-          <w:color w:val="3366FF"/>
-          <w:sz w:val="41"/>
-          <w:szCs w:val="41"/>
-          <w:lang w:val="en-US"/>
-        </w:rPr>
-        <w:t>học</w:t>
-      </w:r>
-      <w:proofErr w:type="spellEnd"/>
-      <w:r>
-        <w:rPr>
-          <w:rFonts w:ascii="Cambria" w:eastAsia="Roboto" w:hAnsi="Cambria" w:cs="Roboto"/>
-          <w:b/>
-          <w:bCs/>
-          <w:i/>
-          <w:iCs/>
-          <w:color w:val="3366FF"/>
-          <w:sz w:val="41"/>
-          <w:szCs w:val="41"/>
-          <w:lang w:val="en-US"/>
-        </w:rPr>
-        <w:t xml:space="preserve"> </w:t>
-      </w:r>
-      <w:proofErr w:type="spellStart"/>
-      <w:r>
-        <w:rPr>
-          <w:rFonts w:ascii="Cambria" w:eastAsia="Roboto" w:hAnsi="Cambria" w:cs="Roboto"/>
-          <w:b/>
-          <w:bCs/>
-          <w:i/>
-          <w:iCs/>
-          <w:color w:val="3366FF"/>
-          <w:sz w:val="41"/>
-          <w:szCs w:val="41"/>
-          <w:lang w:val="en-US"/>
-        </w:rPr>
-        <w:t>lại</w:t>
-      </w:r>
-      <w:proofErr w:type="spellEnd"/>
-      <w:r>
-        <w:rPr>
-          <w:rFonts w:ascii="Cambria" w:eastAsia="Roboto" w:hAnsi="Cambria" w:cs="Roboto"/>
-          <w:b/>
-          <w:bCs/>
-          <w:i/>
-          <w:iCs/>
-          <w:color w:val="3366FF"/>
-          <w:sz w:val="41"/>
-          <w:szCs w:val="41"/>
-          <w:lang w:val="en-US"/>
-        </w:rPr>
-        <w:t xml:space="preserve">/ </w:t>
-      </w:r>
-      <w:proofErr w:type="spellStart"/>
-      <w:r>
-        <w:rPr>
-          <w:rFonts w:ascii="Cambria" w:eastAsia="Roboto" w:hAnsi="Cambria" w:cs="Roboto"/>
-          <w:b/>
-          <w:bCs/>
-          <w:i/>
-          <w:iCs/>
-          <w:color w:val="3366FF"/>
-          <w:sz w:val="41"/>
-          <w:szCs w:val="41"/>
-          <w:lang w:val="en-US"/>
-        </w:rPr>
-        <w:t>học</w:t>
-      </w:r>
-      <w:proofErr w:type="spellEnd"/>
-      <w:r>
-        <w:rPr>
-          <w:rFonts w:ascii="Cambria" w:eastAsia="Roboto" w:hAnsi="Cambria" w:cs="Roboto"/>
-          <w:b/>
-          <w:bCs/>
-          <w:i/>
-          <w:iCs/>
-          <w:color w:val="3366FF"/>
-          <w:sz w:val="41"/>
-          <w:szCs w:val="41"/>
-          <w:lang w:val="en-US"/>
-        </w:rPr>
-        <w:t xml:space="preserve"> </w:t>
-      </w:r>
-      <w:proofErr w:type="spellStart"/>
-      <w:r>
-        <w:rPr>
-          <w:rFonts w:ascii="Cambria" w:eastAsia="Roboto" w:hAnsi="Cambria" w:cs="Roboto"/>
-          <w:b/>
-          <w:bCs/>
-          <w:i/>
-          <w:iCs/>
-          <w:color w:val="3366FF"/>
-          <w:sz w:val="41"/>
-          <w:szCs w:val="41"/>
-          <w:lang w:val="en-US"/>
-        </w:rPr>
-        <w:t>cải</w:t>
-      </w:r>
-      <w:proofErr w:type="spellEnd"/>
-      <w:r>
-        <w:rPr>
-          <w:rFonts w:ascii="Cambria" w:eastAsia="Roboto" w:hAnsi="Cambria" w:cs="Roboto"/>
-          <w:b/>
-          <w:bCs/>
-          <w:i/>
-          <w:iCs/>
-          <w:color w:val="3366FF"/>
-          <w:sz w:val="41"/>
-          <w:szCs w:val="41"/>
-          <w:lang w:val="en-US"/>
-        </w:rPr>
-        <w:t xml:space="preserve"> </w:t>
-      </w:r>
-      <w:proofErr w:type="spellStart"/>
-      <w:r>
-        <w:rPr>
-          <w:rFonts w:ascii="Cambria" w:eastAsia="Roboto" w:hAnsi="Cambria" w:cs="Roboto"/>
-          <w:b/>
-          <w:bCs/>
-          <w:i/>
-          <w:iCs/>
-          <w:color w:val="3366FF"/>
-          <w:sz w:val="41"/>
-          <w:szCs w:val="41"/>
-          <w:lang w:val="en-US"/>
-        </w:rPr>
-        <w:t>thiện</w:t>
-      </w:r>
-      <w:proofErr w:type="spellEnd"/>
-      <w:r>
-        <w:rPr>
-          <w:rFonts w:ascii="Cambria" w:eastAsia="Roboto" w:hAnsi="Cambria" w:cs="Roboto"/>
-          <w:b/>
-          <w:bCs/>
-          <w:i/>
-          <w:iCs/>
-          <w:color w:val="3366FF"/>
-          <w:sz w:val="41"/>
-          <w:szCs w:val="41"/>
-          <w:lang w:val="en-US"/>
-        </w:rPr>
-        <w:t xml:space="preserve"> </w:t>
-      </w:r>
-      <w:proofErr w:type="spellStart"/>
-      <w:r>
-        <w:rPr>
-          <w:rFonts w:ascii="Cambria" w:eastAsia="Roboto" w:hAnsi="Cambria" w:cs="Roboto"/>
-          <w:b/>
-          <w:bCs/>
-          <w:i/>
-          <w:iCs/>
-          <w:color w:val="3366FF"/>
-          <w:sz w:val="41"/>
-          <w:szCs w:val="41"/>
-          <w:lang w:val="en-US"/>
-        </w:rPr>
-        <w:t>môn</w:t>
-      </w:r>
-      <w:proofErr w:type="spellEnd"/>
-      <w:r>
-        <w:rPr>
-          <w:rFonts w:ascii="Cambria" w:eastAsia="Roboto" w:hAnsi="Cambria" w:cs="Roboto"/>
-          <w:b/>
-          <w:bCs/>
-          <w:i/>
-          <w:iCs/>
-          <w:color w:val="3366FF"/>
-          <w:sz w:val="41"/>
-          <w:szCs w:val="41"/>
-          <w:lang w:val="en-US"/>
-        </w:rPr>
-        <w:t xml:space="preserve"> </w:t>
-      </w:r>
-      <w:proofErr w:type="spellStart"/>
-      <w:r>
-        <w:rPr>
-          <w:rFonts w:ascii="Cambria" w:eastAsia="Roboto" w:hAnsi="Cambria" w:cs="Roboto"/>
-          <w:b/>
-          <w:bCs/>
-          <w:i/>
-          <w:iCs/>
-          <w:color w:val="3366FF"/>
-          <w:sz w:val="41"/>
-          <w:szCs w:val="41"/>
-          <w:lang w:val="en-US"/>
-        </w:rPr>
-        <w:t>này</w:t>
-      </w:r>
-      <w:proofErr w:type="spellEnd"/>
-      <w:r>
-        <w:rPr>
-          <w:rFonts w:ascii="Cambria" w:eastAsia="Roboto" w:hAnsi="Cambria" w:cs="Roboto"/>
-          <w:b/>
-          <w:bCs/>
-          <w:i/>
-          <w:iCs/>
-          <w:color w:val="3366FF"/>
-          <w:sz w:val="41"/>
-          <w:szCs w:val="41"/>
-          <w:lang w:val="en-US"/>
-        </w:rPr>
-        <w:t>.</w:t>
-      </w:r>
-    </w:p>
-    <w:p>
-      <w:pPr>
-        <w:shd w:val="clear" w:color="auto" w:fill="FFFFFF"/>
-        <w:spacing w:after="400"/>
-        <w:rPr>
-          <w:rFonts w:ascii="Cambria" w:eastAsia="Roboto" w:hAnsi="Cambria" w:cs="Roboto"/>
-          <w:b/>
-          <w:bCs/>
-          <w:color w:val="3366FF"/>
-          <w:sz w:val="41"/>
-          <w:szCs w:val="41"/>
-          <w:lang w:val="en-US"/>
-        </w:rPr>
-      </w:pPr>
-      <w:r>
-        <w:rPr>
-          <w:rFonts w:ascii="Cambria" w:eastAsia="Roboto" w:hAnsi="Cambria" w:cs="Roboto"/>
-          <w:b/>
-          <w:bCs/>
-          <w:color w:val="3366FF"/>
-          <w:sz w:val="41"/>
-          <w:szCs w:val="41"/>
-          <w:lang w:val="en-US"/>
-        </w:rPr>
-        <w:t xml:space="preserve">Link </w:t>
-      </w:r>
-      <w:proofErr w:type="spellStart"/>
-      <w:r>
-        <w:rPr>
-          <w:rFonts w:ascii="Cambria" w:eastAsia="Roboto" w:hAnsi="Cambria" w:cs="Roboto"/>
-          <w:b/>
-          <w:bCs/>
-          <w:color w:val="3366FF"/>
-          <w:sz w:val="41"/>
-          <w:szCs w:val="41"/>
-          <w:lang w:val="en-US"/>
-        </w:rPr>
-        <w:t>tham</w:t>
-      </w:r>
-      <w:proofErr w:type="spellEnd"/>
-      <w:r>
-        <w:rPr>
-          <w:rFonts w:ascii="Cambria" w:eastAsia="Roboto" w:hAnsi="Cambria" w:cs="Roboto"/>
-          <w:b/>
-          <w:bCs/>
-          <w:color w:val="3366FF"/>
-          <w:sz w:val="41"/>
-          <w:szCs w:val="41"/>
-          <w:lang w:val="en-US"/>
-        </w:rPr>
-        <w:t xml:space="preserve"> </w:t>
-      </w:r>
-      <w:proofErr w:type="spellStart"/>
-      <w:r>
-        <w:rPr>
-          <w:rFonts w:ascii="Cambria" w:eastAsia="Roboto" w:hAnsi="Cambria" w:cs="Roboto"/>
-          <w:b/>
-          <w:bCs/>
-          <w:color w:val="3366FF"/>
-          <w:sz w:val="41"/>
-          <w:szCs w:val="41"/>
-          <w:lang w:val="en-US"/>
-        </w:rPr>
-        <w:t>khảo</w:t>
-      </w:r>
-      <w:proofErr w:type="spellEnd"/>
-      <w:r>
-        <w:rPr>
-          <w:rFonts w:ascii="Cambria" w:eastAsia="Roboto" w:hAnsi="Cambria" w:cs="Roboto"/>
-          <w:b/>
-          <w:bCs/>
-          <w:color w:val="3366FF"/>
-          <w:sz w:val="41"/>
-          <w:szCs w:val="41"/>
-          <w:lang w:val="en-US"/>
-        </w:rPr>
-        <w:t xml:space="preserve"> </w:t>
-      </w:r>
-      <w:r>
-        <w:rPr>
-          <w:rFonts w:ascii="Cambria" w:eastAsia="Roboto" w:hAnsi="Cambria" w:cs="Roboto"/>
-          <w:b/>
-          <w:bCs/>
-          <w:color w:val="3366FF"/>
-          <w:sz w:val="41"/>
-          <w:szCs w:val="41"/>
-          <w:lang w:val="en-US"/>
-        </w:rPr>
-        <w:t>https://www.citd.edu.vn/thong-bao-dang-ky-hoc-phan-hoc-lai-hoc-cai-thien-hk2-2025-2026/</w:t>
-      </w:r>
-    </w:p>
-    <w:p>
-      <w:pPr>
-        <w:shd w:val="clear" w:color="auto" w:fill="FFFFFF"/>
-        <w:spacing w:after="400"/>
-        <w:rPr>
-          <w:rFonts w:ascii="Verdana" w:eastAsia="Verdana" w:hAnsi="Verdana" w:cs="Verdana"/>
-          <w:color w:val="222222"/>
-          <w:sz w:val="23"/>
-          <w:szCs w:val="23"/>
-          <w:lang w:val="en-US"/>
-        </w:rPr>
       </w:pPr>
       <w:r>
         <w:rPr>
@@ -6861,7 +5177,6 @@
           <w:sz w:val="23"/>
           <w:szCs w:val="23"/>
         </w:rPr>
-        <w:lastRenderedPageBreak/>
         <w:drawing>
           <wp:anchor distT="0" distB="0" distL="114300" distR="114300" simplePos="0" relativeHeight="251658240" behindDoc="0" locked="0" layoutInCell="1" allowOverlap="1" wp14:anchorId="2FC81B97" wp14:editId="70754015">
             <wp:simplePos x="914400" y="7700433"/>
@@ -6884,7 +5199,7 @@
                     <pic:cNvPicPr preferRelativeResize="0"/>
                   </pic:nvPicPr>
                   <pic:blipFill>
-                    <a:blip r:embed="rId17"/>
+                    <a:blip r:embed="rId22"/>
                     <a:srcRect/>
                     <a:stretch>
                       <a:fillRect/>

</xml_diff>